<commit_message>
fix: correct verified errors (TCOM altitude, NASAMS cost, cost ratio, Trophy range), add URLs to all references, populate verification log
Co-authored-by: Cursor <cursoragent@cursor.com>
</commit_message>
<xml_diff>
--- a/exports/research-en.docx
+++ b/exports/research-en.docx
@@ -766,7 +766,7 @@
         <w:pStyle w:val="ListBullet"/>
       </w:pPr>
       <w:r>
-        <w:t>Cost-exchange ratio of 30,000:1 in the attacker's favor (two $30K drones vs one $1B radar)</w:t>
+        <w:t>Cost-exchange ratio of ~16,700:1 in the attacker's favor (two $30K drones vs one $1B radar system)</w:t>
       </w:r>
     </w:p>
     <w:p>
@@ -953,7 +953,7 @@
               <w:rPr>
                 <w:sz w:val="18"/>
               </w:rPr>
-              <w:t>$500K</w:t>
+              <w:t>$1–1.5M</w:t>
             </w:r>
           </w:p>
         </w:tc>
@@ -4486,7 +4486,7 @@
               <w:rPr>
                 <w:sz w:val="18"/>
               </w:rPr>
-              <w:t>3,660m</w:t>
+              <w:t>4,600m</w:t>
             </w:r>
           </w:p>
         </w:tc>
@@ -6211,7 +6211,7 @@
         <w:br/>
         <w:t xml:space="preserve">        │  Recon drones                │ Platform: Airlander 10</w:t>
         <w:br/>
-        <w:t>3,660m ─┤─────────────────────────────── TCOM 420K max ceiling</w:t>
+        <w:t>4,600m ─┤─────────────────────────────── TCOM 420K max ceiling</w:t>
         <w:br/>
         <w:t xml:space="preserve">        │                              │</w:t>
         <w:br/>
@@ -7746,7 +7746,7 @@
               <w:rPr>
                 <w:sz w:val="18"/>
               </w:rPr>
-              <w:t>$500M</w:t>
+              <w:t>$1–1.5B</w:t>
             </w:r>
           </w:p>
         </w:tc>
@@ -8435,7 +8435,7 @@
               <w:rPr>
                 <w:sz w:val="18"/>
               </w:rPr>
-              <w:t>Close-range only (~30m)</w:t>
+              <w:t>Close-range only (&lt;50m)</w:t>
             </w:r>
           </w:p>
         </w:tc>
@@ -11575,7 +11575,7 @@
               <w:rPr>
                 <w:sz w:val="18"/>
               </w:rPr>
-              <w:t>Airlander 10: 6,096m, TCOM: 3,660m — covers threat band</w:t>
+              <w:t>Airlander 10: 6,096m, TCOM: 4,600m — covers threat band</w:t>
             </w:r>
           </w:p>
         </w:tc>
@@ -11880,7 +11880,7 @@
     </w:p>
     <w:p>
       <w:r>
-        <w:t>Reality: Ukraine's interception rate is 70–85%. On a 200-drone salvo, 30–60 warheads reach targets every night. Two $30K drones destroyed a $1B AN/TPY-2 radar. The cost-exchange ratio is 30,000:1 favoring the attacker.</w:t>
+        <w:t>Reality: Ukraine's interception rate is 70–85%. On a 200-drone salvo, 30–60 warheads reach targets every night. Two $30K drones destroyed a $1B AN/TPY-2 radar. The cost-exchange ratio is ~16,700:1 favoring the attacker.</w:t>
       </w:r>
     </w:p>
     <w:p>
@@ -12954,27 +12954,27 @@
     </w:p>
     <w:p>
       <w:r>
-        <w:t>[M1] Hitex, "12K 160g 20mm Carbon Fiber Mesh Geo Grid," Made-in-China.com, 2025–2026. Product code HIT-2020.</w:t>
-      </w:r>
-    </w:p>
-    <w:p>
-      <w:r>
-        <w:t>[M2] Aerolite Technology, "Carbon Fiber Mesh | 20x20mm Carbon Fiber Grid," aerolitetech.com, 2025.</w:t>
-      </w:r>
-    </w:p>
-    <w:p>
-      <w:r>
-        <w:t>[M3] CNC Carbon Fiber, "3K Twill Weave Carbon Fiber Fabric – Technical Data Sheet," cnccarbonfiber.com, 2025.</w:t>
-      </w:r>
-    </w:p>
-    <w:p>
-      <w:r>
-        <w:t>[M4] Rhino Carbon Fiber, "200 GSM Unidirectional TDS," rhinocarbonfiber.com, October 2025.</w:t>
-      </w:r>
-    </w:p>
-    <w:p>
-      <w:r>
-        <w:t>[M5] Polymer Composites Journal, "High-velocity impact resistance of carbon fiber composite grid sandwich structures," DOI: 10.1002/pc.28147, 2024.</w:t>
+        <w:t>[M1] Hitex, "12K 160g 20mm Carbon Fiber Mesh Geo Grid," Made-in-China.com, 2025–2026. Product code HIT-2020. https://nbhitex.en.made-in-china.com/product/GtRUfpHrROWz/China-12K-160g-20mm-Carbon-Fiber-Mesh-Geo-Grid-for-Concrete-Construction.html</w:t>
+      </w:r>
+    </w:p>
+    <w:p>
+      <w:r>
+        <w:t>[M2] Aerolite Technology, "Carbon Fiber Mesh | 20x20mm Carbon Fiber Grid," aerolitetech.com, 2025. https://www.aerolitetech.com/carbon-fiber-grid-20x20mm.html</w:t>
+      </w:r>
+    </w:p>
+    <w:p>
+      <w:r>
+        <w:t>[M3] CNC Carbon Fiber, "3K Twill Weave Carbon Fiber Fabric – Technical Data Sheet," cnccarbonfiber.com, 2025. https://www.cnccarbonfiber.com/carbon-fiber-fabric/3k-twill-weave-carbon-fiber-fabric.html</w:t>
+      </w:r>
+    </w:p>
+    <w:p>
+      <w:r>
+        <w:t>[M4] Rhino Carbon Fiber, "200 GSM Unidirectional TDS," rhinocarbonfiber.com, October 2025. https://www.rhinocarbonfiber.com/content/files/technical-info/tds/rhino%20carbon%20fiber%20200%20gsm%20unidirectional%2010_2025.pdf</w:t>
+      </w:r>
+    </w:p>
+    <w:p>
+      <w:r>
+        <w:t>[M5] Polymer Composites Journal, "High-velocity impact resistance of carbon fiber composite grid sandwich structures," DOI: 10.1002/pc.28147, 2024. https://doi.org/10.1002/pc.28147</w:t>
       </w:r>
     </w:p>
     <w:p>
@@ -12987,42 +12987,42 @@
     </w:p>
     <w:p>
       <w:r>
-        <w:t>[A1] Hybrid Air Vehicles, "First military aircraft reservation for Airlander," hybridairvehicles.com, October 2025.</w:t>
-      </w:r>
-    </w:p>
-    <w:p>
-      <w:r>
-        <w:t>[A2] The Defense Post, "UK Firm HAV Secures First Defense Orders for Airlander 10," October 28, 2025.</w:t>
-      </w:r>
-    </w:p>
-    <w:p>
-      <w:r>
-        <w:t>[A3] Zeppelin Flug, "Zeppelin NT Technical Data," zeppelinflug.de, 2025.</w:t>
-      </w:r>
-    </w:p>
-    <w:p>
-      <w:r>
-        <w:t>[A4] TechFundingNews, "NATO-backed Kelluu secures €15M to tackle hybrid warfare threats," 2026.</w:t>
-      </w:r>
-    </w:p>
-    <w:p>
-      <w:r>
-        <w:t>[A5] TCOM LP, "Advancing the Next — TCOM Fact Sheet," tcomlp.com, May 2024.</w:t>
-      </w:r>
-    </w:p>
-    <w:p>
-      <w:r>
-        <w:t>[A6] Skyship Services / Global Aerostats, "74K Aerostat," globalaerostats.com, 2025.</w:t>
-      </w:r>
-    </w:p>
-    <w:p>
-      <w:r>
-        <w:t>[A7] Heavy Lift &amp; Project Forwarding International, "Flying Whales take delivery of test engine," March 20, 2026.</w:t>
-      </w:r>
-    </w:p>
-    <w:p>
-      <w:r>
-        <w:t>[A8] US Air Combat Command, "Tethered Aerostat Radar System Fact Sheet," acc.af.mil.</w:t>
+        <w:t>[A1] Hybrid Air Vehicles, "First military aircraft reservation for Airlander," hybridairvehicles.com, October 2025. https://www.hybridairvehicles.com/news/overview/news/first-military-aircraft-reservation-for-airlander/</w:t>
+      </w:r>
+    </w:p>
+    <w:p>
+      <w:r>
+        <w:t>[A2] The Defense Post, "UK Firm HAV Secures First Defense Orders for Airlander 10," October 28, 2025. https://thedefensepost.com/2025/10/28/hav-airlander-first-order/</w:t>
+      </w:r>
+    </w:p>
+    <w:p>
+      <w:r>
+        <w:t>[A3] Zeppelin Flug, "Zeppelin NT Technical Data," zeppelinflug.de, 2025. https://zeppelinflug.de/en/zeppelin-nt/technik</w:t>
+      </w:r>
+    </w:p>
+    <w:p>
+      <w:r>
+        <w:t>[A4] TechFundingNews, "NATO-backed Kelluu secures €15M to tackle hybrid warfare threats," 2026. https://techfundingnews.com/kelluu-15m-series-a-nato-innovation-fund/</w:t>
+      </w:r>
+    </w:p>
+    <w:p>
+      <w:r>
+        <w:t>[A5] TCOM LP, "Advancing the Next — TCOM Fact Sheet," tcomlp.com, May 2024. https://tcomlp.com/wp-content/uploads/2024/05/TCOM-Fact-Sheet-2024.pdf</w:t>
+      </w:r>
+    </w:p>
+    <w:p>
+      <w:r>
+        <w:t>[A6] Skyship Services / Global Aerostats, "74K Aerostat," globalaerostats.com, 2025. https://globalaerostats.com/74k-aerostat/</w:t>
+      </w:r>
+    </w:p>
+    <w:p>
+      <w:r>
+        <w:t>[A7] Heavy Lift &amp; Project Forwarding International, "Flying Whales take delivery of test engine," March 20, 2026. https://www.heavyliftpfi.com/shipping/2026/03/20/test-engine-delivered-to-flying-whales-as-it-signs-ivory-coast-logistics-deal/</w:t>
+      </w:r>
+    </w:p>
+    <w:p>
+      <w:r>
+        <w:t>[A8] US Air Combat Command, "Tethered Aerostat Radar System Fact Sheet," acc.af.mil. https://www.acc.af.mil/About-Us/Fact-Sheets/Display/Article/199137/tethered-aerostat-radar-system/</w:t>
       </w:r>
     </w:p>
     <w:p>
@@ -13035,57 +13035,57 @@
     </w:p>
     <w:p>
       <w:r>
-        <w:t>[T1] Ukraine War Analytics, "How Ukraine Shoots Down Shahed Drones: Interception Methods 2026," ukraine-war-analytics.com, 2026.</w:t>
-      </w:r>
-    </w:p>
-    <w:p>
-      <w:r>
-        <w:t>[T2] Kyiv Post, "50,000 Shahed – How Ukrainians Became Experts Countering Iranian-Russian Drones," September 2025.</w:t>
-      </w:r>
-    </w:p>
-    <w:p>
-      <w:r>
-        <w:t>[T3] Odessa Journal, "Russia Has Changed Its Tactics of Kamikaze Drone Strikes," 2025.</w:t>
-      </w:r>
-    </w:p>
-    <w:p>
-      <w:r>
-        <w:t>[T4] Wikipedia, "Kh-101," en.wikipedia.org (verified against CSIS Missile Threat database).</w:t>
-      </w:r>
-    </w:p>
-    <w:p>
-      <w:r>
-        <w:t>[T5] CSIS Missile Threat, "Kh-101/Kh-102," missilethreat.csis.org.</w:t>
-      </w:r>
-    </w:p>
-    <w:p>
-      <w:r>
-        <w:t>[T6] Airpra.com, "In-depth Analysis of 3M Series Kalibr Cruise Missiles," 2023.</w:t>
-      </w:r>
-    </w:p>
-    <w:p>
-      <w:r>
-        <w:t>[T7] www1.ru, "Flight of Kalibr-NK at extremely low altitude filmed for the first time," April 25, 2025.</w:t>
-      </w:r>
-    </w:p>
-    <w:p>
-      <w:r>
-        <w:t>[T8] Ukraine War Analytics, "Multirotor Drone Maneuverability Ukraine 2026," ukraine-war-analytics.com, 2026.</w:t>
-      </w:r>
-    </w:p>
-    <w:p>
-      <w:r>
-        <w:t>[T9] RBC-Ukraine, "Fiber-optic drones – How they work, types Russia uses, Ukraine responding," July 2026.</w:t>
-      </w:r>
-    </w:p>
-    <w:p>
-      <w:r>
-        <w:t>[T10] CNN, "Hezbollah deploys a potent new weapon designed to evade Israeli detection," May 3, 2026.</w:t>
-      </w:r>
-    </w:p>
-    <w:p>
-      <w:r>
-        <w:t>[T11] Defense News, "Frustrating Israel, fiber-optic killer drone technology has arrived in southern Lebanon," June 23, 2026.</w:t>
+        <w:t>[T1] Ukraine War Analytics, "How Ukraine Shoots Down Shahed Drones: Interception Methods 2026," ukraine-war-analytics.com, 2026. https://ukraine-war-analytics.com/weapons/shahed-interception-methods-2026.html</w:t>
+      </w:r>
+    </w:p>
+    <w:p>
+      <w:r>
+        <w:t>[T2] Kyiv Post, "50,000 Shahed – How Ukrainians Became Experts Countering Iranian-Russian Drones," September 2025. https://www.kyivpost.com/post/71888</w:t>
+      </w:r>
+    </w:p>
+    <w:p>
+      <w:r>
+        <w:t>[T3] Odessa Journal, "Russia Has Changed Its Tactics of Kamikaze Drone Strikes," 2025. https://mail.odessa-journal.com/alexander-kovalenko-russia-has-changed-its-tactics-of-kamikaze-drone-strikes-on-ukraine</w:t>
+      </w:r>
+    </w:p>
+    <w:p>
+      <w:r>
+        <w:t>[T4] Wikipedia, "Kh-101," en.wikipedia.org (verified against CSIS Missile Threat database). https://en.wikipedia.org/wiki/Kh-101</w:t>
+      </w:r>
+    </w:p>
+    <w:p>
+      <w:r>
+        <w:t>[T5] CSIS Missile Threat, "Kh-101/Kh-102," missilethreat.csis.org. https://missilethreat.csis.org/missile/kh-101-kh-102/</w:t>
+      </w:r>
+    </w:p>
+    <w:p>
+      <w:r>
+        <w:t>[T6] Airpra.com, "In-depth Analysis of 3M Series Kalibr Cruise Missiles," 2023. https://airpra.com/in-depth-analysis-of-3m-series-kalibr-cruise-missiles/</w:t>
+      </w:r>
+    </w:p>
+    <w:p>
+      <w:r>
+        <w:t>[T7] www1.ru, "Flight of Kalibr-NK at extremely low altitude filmed for the first time," April 25, 2025. https://www1.ru/en/news/2025/04/25/polet-krylatoi-rakety-kalibr-nk-na-sverxnizkoi-vysote-vpervye-sniali-na-video.html</w:t>
+      </w:r>
+    </w:p>
+    <w:p>
+      <w:r>
+        <w:t>[T8] Ukraine War Analytics, "Multirotor Drone Maneuverability Ukraine 2026," ukraine-war-analytics.com, 2026. https://ukraine-war-analytics.com/drones/multirotor-drone-maneuverability.html</w:t>
+      </w:r>
+    </w:p>
+    <w:p>
+      <w:r>
+        <w:t>[T9] RBC-Ukraine, "Fiber-optic drones – How they work, types Russia uses, Ukraine responding," July 2026. https://newsukraine.rbc.ua/analytics/russia-s-fiber-optic-fpv-drones-on-rise-ukraine-1752818725.html</w:t>
+      </w:r>
+    </w:p>
+    <w:p>
+      <w:r>
+        <w:t>[T10] CNN, "Hezbollah deploys a potent new weapon designed to evade Israeli detection," May 3, 2026. https://www.cnn.com/2026/05/03/middleeast/hezbollah-fiber-optic-drones-israel-intl-cmd</w:t>
+      </w:r>
+    </w:p>
+    <w:p>
+      <w:r>
+        <w:t>[T11] Defense News, "Frustrating Israel, fiber-optic killer drone technology has arrived in southern Lebanon," June 23, 2026. https://www.defensenews.com/global/mideast-africa/2026/06/23/frustrating-israel-fiber-optic-killer-drone-technology-has-arrived-in-southern-lebanon/</w:t>
       </w:r>
     </w:p>
     <w:p>
@@ -13098,37 +13098,37 @@
     </w:p>
     <w:p>
       <w:r>
-        <w:t>[G1] Wikipedia, "Geography of Lebanon" (border: 79 km with Israel).</w:t>
-      </w:r>
-    </w:p>
-    <w:p>
-      <w:r>
-        <w:t>[G2] INSS (Institute for National Security Studies), "Between War and Agreement with Lebanon: The Conflict Over the Land Border."</w:t>
-      </w:r>
-    </w:p>
-    <w:p>
-      <w:r>
-        <w:t>[G3] Durham University IBRU, "Israel-Lebanon Border Analysis" (4 topographical sectors, ~120 km).</w:t>
-      </w:r>
-    </w:p>
-    <w:p>
-      <w:r>
-        <w:t>[G4] Wikipedia, "Golan Heights" (65 km N-S, 12–25 km E-W).</w:t>
-      </w:r>
-    </w:p>
-    <w:p>
-      <w:r>
-        <w:t>[G5] Wikipedia, "UNDOF Zone" (~80 km long, 0.2–10 km wide).</w:t>
-      </w:r>
-    </w:p>
-    <w:p>
-      <w:r>
-        <w:t>[G6] Sovereign Limits, "Israel-Jordan Land Boundary" (482 km).</w:t>
-      </w:r>
-    </w:p>
-    <w:p>
-      <w:r>
-        <w:t>[G7] UN Peacemaker, "Treaty of Peace Between Israel and Jordan," October 26, 1994.</w:t>
+        <w:t>[G1] Wikipedia, "Geography of Lebanon" (border: 79 km with Israel). https://en.wikipedia.org/wiki/Geography_of_Lebanon</w:t>
+      </w:r>
+    </w:p>
+    <w:p>
+      <w:r>
+        <w:t>[G2] INSS (Institute for National Security Studies), "Between War and Agreement with Lebanon: The Conflict Over the Land Border." https://www.inss.org.il/publication/lebanon-border/</w:t>
+      </w:r>
+    </w:p>
+    <w:p>
+      <w:r>
+        <w:t>[G3] Durham University IBRU, "Israel-Lebanon Border Analysis" (4 topographical sectors, ~120 km). https://www.durham.ac.uk/media/durham-university/research-/research-centres/ibru-centre-for-borders-research/maps-and-databases/publications-database/boundary-amp-security-bulletins/bsb8-4_eshel.pdf</w:t>
+      </w:r>
+    </w:p>
+    <w:p>
+      <w:r>
+        <w:t>[G4] Wikipedia, "Golan Heights" (65 km N-S, 12–25 km E-W). https://en.wikipedia.org/wiki/Golan_Heights</w:t>
+      </w:r>
+    </w:p>
+    <w:p>
+      <w:r>
+        <w:t>[G5] Wikipedia, "UNDOF Zone" (~80 km long, 0.2–10 km wide). https://en.wikipedia.org/wiki/UNDOF_Zone</w:t>
+      </w:r>
+    </w:p>
+    <w:p>
+      <w:r>
+        <w:t>[G6] Sovereign Limits, "Israel-Jordan Land Boundary" (482 km). https://sovereignlimits.com/boundaries/israel-jordan-land</w:t>
+      </w:r>
+    </w:p>
+    <w:p>
+      <w:r>
+        <w:t>[G7] UN Peacemaker, "Treaty of Peace Between Israel and Jordan," October 26, 1994. https://peacemaker.un.org/sites/default/files/document/files/2024/05/il20jo941026peacetreatyisraeljordan.pdf</w:t>
       </w:r>
     </w:p>
     <w:p>
@@ -13141,27 +13141,27 @@
     </w:p>
     <w:p>
       <w:r>
-        <w:t>[C1] BBC, "FPV drone strikes show Hezbollah's changing tactics against Israel," 2026.</w:t>
-      </w:r>
-    </w:p>
-    <w:p>
-      <w:r>
-        <w:t>[C2] Foreign Policy, "Israel Has a Hezbollah Drone Problem in Lebanon," June 30, 2026.</w:t>
-      </w:r>
-    </w:p>
-    <w:p>
-      <w:r>
-        <w:t>[C3] Alma Research Center, "Special Report: Hezbollah's FPV Explosive Drone Threat," 2026.</w:t>
-      </w:r>
-    </w:p>
-    <w:p>
-      <w:r>
-        <w:t>[C4] Alma Research Center, "The Potential Terror Infrastructure of Iran and Hezbollah in Southern Syria," 2025.</w:t>
-      </w:r>
-    </w:p>
-    <w:p>
-      <w:r>
-        <w:t>[C5] FDD Long War Journal, "IDF raid Iran-linked terror cell in Syria," July 2025.</w:t>
+        <w:t>[C1] BBC, "FPV drone strikes show Hezbollah's changing tactics against Israel," 2026. https://www.bbc.com/news/articles/c1j2zwe9g5no</w:t>
+      </w:r>
+    </w:p>
+    <w:p>
+      <w:r>
+        <w:t>[C2] Foreign Policy, "Israel Has a Hezbollah Drone Problem in Lebanon," June 30, 2026. https://foreignpolicy.com/2026/06/30/israel-hezbollah-drones-lebanon-fpv-iran-idf/</w:t>
+      </w:r>
+    </w:p>
+    <w:p>
+      <w:r>
+        <w:t>[C3] Alma Research Center, "Special Report: Hezbollah's FPV Explosive Drone Threat," 2026. https://israel-alma.org/special-report-hezbollahs-fpv-explosive-drone-threat/</w:t>
+      </w:r>
+    </w:p>
+    <w:p>
+      <w:r>
+        <w:t>[C4] Alma Research Center, "The Potential Terror Infrastructure of Iran and Hezbollah in Southern Syria," 2025. https://israel-alma.org/the-potential-terror-infrastructure-of-iran-and-hezbollah-in-southern-syria-is-deployed-across-dozens-of-localities/</w:t>
+      </w:r>
+    </w:p>
+    <w:p>
+      <w:r>
+        <w:t>[C5] FDD Long War Journal, "IDF raid Iran-linked terror cell in Syria," July 2025. https://www.longwarjournal.org/archives/2025/07/israel-defense-forces-raid-iran-linked-terror-cell-in-syria.php</w:t>
       </w:r>
     </w:p>
     <w:p>
@@ -13174,27 +13174,27 @@
     </w:p>
     <w:p>
       <w:r>
-        <w:t>[E1] Ukraine War Analytics, "Ukraine Drone Defence Economics 2026," ukraine-war-analytics.com.</w:t>
-      </w:r>
-    </w:p>
-    <w:p>
-      <w:r>
-        <w:t>[E2] Euromaidan Press, "Russia's Shaheds cost $10,000 each. Ukraine unveiled drone that kills them for $2,000," July 1, 2026.</w:t>
-      </w:r>
-    </w:p>
-    <w:p>
-      <w:r>
-        <w:t>[E3] BattlePolicy.com, "Ukraine's Shahed Interceptor Drones Become an Industry," 2026.</w:t>
-      </w:r>
-    </w:p>
-    <w:p>
-      <w:r>
-        <w:t>[E4] Reuters, "Helium prices soar as Qatar LNG halt exposes fragile supply chain," March 12, 2026.</w:t>
-      </w:r>
-    </w:p>
-    <w:p>
-      <w:r>
-        <w:t>[E5] WestAir Gases, "2026 Helium Shortage: Why Recovery Will Take Years," 2026.</w:t>
+        <w:t>[E1] Ukraine War Analytics, "Ukraine Drone Defence Economics 2026," ukraine-war-analytics.com. https://ukraine-war-analytics.com/analysis/ukraine-drone-defense-economics-2026.html</w:t>
+      </w:r>
+    </w:p>
+    <w:p>
+      <w:r>
+        <w:t>[E2] Euromaidan Press, "Russia's Shaheds cost $10,000 each. Ukraine unveiled drone that kills them for $2,000," July 1, 2026. https://euromaidanpress.com/2026/07/01/russias-shaheds-cost-10000-each-ukraine-just-unveiled-drone-that-kills-them-for-2000/</w:t>
+      </w:r>
+    </w:p>
+    <w:p>
+      <w:r>
+        <w:t>[E3] BattlePolicy.com, "Ukraine's Shahed Interceptor Drones Become an Industry," 2026. https://www.battlepolicy.com/ukraine-turned-shahed-defense-into-an-export-industry-russias-jet-drones-will-test-it/</w:t>
+      </w:r>
+    </w:p>
+    <w:p>
+      <w:r>
+        <w:t>[E4] Reuters, "Helium prices soar as Qatar LNG halt exposes fragile supply chain," March 12, 2026. https://www.reuters.com/business/energy/helium-prices-soar-qatar-lng-halt-exposes-fragile-supply-chain-2026-03-12/</w:t>
+      </w:r>
+    </w:p>
+    <w:p>
+      <w:r>
+        <w:t>[E5] WestAir Gases, "2026 Helium Shortage: Why Recovery Will Take Years," 2026. https://westairgases.com/blog/helium-shortage/</w:t>
       </w:r>
     </w:p>
     <w:p>
@@ -13207,17 +13207,17 @@
     </w:p>
     <w:p>
       <w:r>
-        <w:t>[P1] European Patent EP3769030A1, "Protective Cable Nets System (PCNS)."</w:t>
-      </w:r>
-    </w:p>
-    <w:p>
-      <w:r>
-        <w:t>[P2] US Patent Application 20100102166, "Missile interceptor with net body."</w:t>
-      </w:r>
-    </w:p>
-    <w:p>
-      <w:r>
-        <w:t>[P3] AIAA 2008-6863 / arXiv:0802.1871, "AB-Net Method of Protection from Projectiles."</w:t>
+        <w:t>[P1] European Patent EP3769030A1, "Protective Cable Nets System (PCNS)." https://patents.google.com/patent/EP3769030A1/de</w:t>
+      </w:r>
+    </w:p>
+    <w:p>
+      <w:r>
+        <w:t>[P2] US Patent Application 20100102166, "Missile interceptor with net body." https://www.patents-review.com/a/20100102166-missile-interceptor-net-body.html</w:t>
+      </w:r>
+    </w:p>
+    <w:p>
+      <w:r>
+        <w:t>[P3] AIAA 2008-6863 / arXiv:0802.1871, "AB-Net Method of Protection from Projectiles." https://arxiv.org/pdf/0802.1871</w:t>
       </w:r>
     </w:p>
     <w:p>
@@ -13230,22 +13230,22 @@
     </w:p>
     <w:p>
       <w:r>
-        <w:t>[D1] Rhodius KMS, "Dro-mesh military grade drone defense," rhodius.com/counter-drone.</w:t>
-      </w:r>
-    </w:p>
-    <w:p>
-      <w:r>
-        <w:t>[D2] TSS, "NETFORCE-1 passive anti-drone netting system," tss-me.com.</w:t>
-      </w:r>
-    </w:p>
-    <w:p>
-      <w:r>
-        <w:t>[D3] KnitMesh Technologies, "DroneStop Anti-Drone Mesh at DPRTE 2026," knitmeshtechnologies.com, 2026.</w:t>
-      </w:r>
-    </w:p>
-    <w:p>
-      <w:r>
-        <w:t>[D4] Jared Watkins Research, "Ukraine Conflict: Drone Countermeasures Lessons Learned."</w:t>
+        <w:t>[D1] Rhodius KMS, "Dro-mesh military grade drone defense," rhodius.com/counter-drone. https://www.rhodius.com/counter-drone</w:t>
+      </w:r>
+    </w:p>
+    <w:p>
+      <w:r>
+        <w:t>[D2] TSS, "NETFORCE-1 passive anti-drone netting system," tss-me.com. https://www.tss-me.com/safety-nets-solutions/netforce-1/</w:t>
+      </w:r>
+    </w:p>
+    <w:p>
+      <w:r>
+        <w:t>[D3] KnitMesh Technologies, "DroneStop Anti-Drone Mesh at DPRTE 2026," knitmeshtechnologies.com, 2026. https://knitmeshtechnologies.com/dronestop-anti-drone-mesh-dprte-2026/</w:t>
+      </w:r>
+    </w:p>
+    <w:p>
+      <w:r>
+        <w:t>[D4] Jared Watkins Research, "Ukraine Conflict: Drone Countermeasures Lessons Learned." https://www.jaredwatkins.com/research/drone-detection/ukraine-lessons-learned/</w:t>
       </w:r>
     </w:p>
     <w:p>
@@ -13258,27 +13258,27 @@
     </w:p>
     <w:p>
       <w:r>
-        <w:t>[R1] Business Insider, "Russia to Use WWII Tactic to Defend Against Ukrainian Drone Strikes," July 2024.</w:t>
-      </w:r>
-    </w:p>
-    <w:p>
-      <w:r>
-        <w:t>[R2] Newsweek, "Russia's New Drone Defense 'Inspired' by WWI-Era Zeppelins," 2024.</w:t>
-      </w:r>
-    </w:p>
-    <w:p>
-      <w:r>
-        <w:t>[R3] Militarnyi, "Russia announces development of anti-drone defense based on aerostats," 2024.</w:t>
-      </w:r>
-    </w:p>
-    <w:p>
-      <w:r>
-        <w:t>[R4] HAV, "Susceptibility, Vulnerability, &amp; Survivability," hybridairvehicles.com.</w:t>
-      </w:r>
-    </w:p>
-    <w:p>
-      <w:r>
-        <w:t>[R5] US Navy ONR, "Lighter Than Air Report," 2006.</w:t>
+        <w:t>[R1] Business Insider, "Russia to Use WWII Tactic to Defend Against Ukrainian Drone Strikes," July 2024. https://www.businessinsider.com/russia-use-wwii-tactic-defend-against-ukrainian-drone-strikes-2024-7</w:t>
+      </w:r>
+    </w:p>
+    <w:p>
+      <w:r>
+        <w:t>[R2] Newsweek, "Russia's New Drone Defense 'Inspired' by WWI-Era Zeppelins," 2024. https://www.newsweek.com/russia-zeppelin-drones-ww1-1919945</w:t>
+      </w:r>
+    </w:p>
+    <w:p>
+      <w:r>
+        <w:t>[R3] Militarnyi, "Russia announces development of anti-drone defense based on aerostats," 2024. https://militarnyi.com/en/news/russia-announces-development-of-anti-drone-defense-based-on-aerostats/</w:t>
+      </w:r>
+    </w:p>
+    <w:p>
+      <w:r>
+        <w:t>[R4] HAV, "Susceptibility, Vulnerability, &amp; Survivability," hybridairvehicles.com. https://www.hybridairvehicles.com/news/overview/insights/vulnerability-survivability/</w:t>
+      </w:r>
+    </w:p>
+    <w:p>
+      <w:r>
+        <w:t>[R5] US Navy ONR, "Lighter Than Air Report," 2006. https://www.onr.navy.mil/media/document/2006rptlighterthanairpdf</w:t>
       </w:r>
     </w:p>
     <w:p>
@@ -13291,42 +13291,42 @@
     </w:p>
     <w:p>
       <w:r>
-        <w:t>[L1] Israel Ministry of Defense, "Israel MOD and Rafael Deliver First Operational High-Power Laser System - Iron Beam to the IDF," December 28, 2025.</w:t>
-      </w:r>
-    </w:p>
-    <w:p>
-      <w:r>
-        <w:t>[L2] Rafael Advanced Defense Systems, "IRON BEAM - High Energy Laser Weapon System," rafael.co.il.</w:t>
-      </w:r>
-    </w:p>
-    <w:p>
-      <w:r>
-        <w:t>[L3] Army Recognition, "Israel's Rafael upgrades its Trophy active protection system to counter kamikaze drones," January 2025.</w:t>
-      </w:r>
-    </w:p>
-    <w:p>
-      <w:r>
-        <w:t>[L4] Breaking Defense, "Rafael rolls out Lite Beam laser, Trophy updates to protect vehicles from drone threats," October 2024.</w:t>
-      </w:r>
-    </w:p>
-    <w:p>
-      <w:r>
-        <w:t>[L5] Ukraine War Analytics, "Counter-Drone Laser Systems in Ukraine 2026: DEW Analysis," ukraine-war-analytics.com.</w:t>
-      </w:r>
-    </w:p>
-    <w:p>
-      <w:r>
-        <w:t>[L6] Robotics.press, "Deployment Report: Directed Energy Counter-UAS Systems," March 2026.</w:t>
-      </w:r>
-    </w:p>
-    <w:p>
-      <w:r>
-        <w:t>[L7] US GAO, "Directed Energy Weapons: DOD Should Focus on Transition Planning," GAO-23-105868, 2023.</w:t>
-      </w:r>
-    </w:p>
-    <w:p>
-      <w:r>
-        <w:t>[L8] Congressional Research Service, "Department of Defense Directed Energy Weapons: Background and Issues for Congress," R46925.</w:t>
+        <w:t>[L1] Israel Ministry of Defense, "Israel MOD and Rafael Deliver First Operational High-Power Laser System - Iron Beam to the IDF," December 28, 2025. https://mod.gov.il/en/press-releases/press-room/israel-mod-and-rafael-deliver-first-operational-high-power-laser-system-iron-beam-to-the-idf</w:t>
+      </w:r>
+    </w:p>
+    <w:p>
+      <w:r>
+        <w:t>[L2] Rafael Advanced Defense Systems, "IRON BEAM - High Energy Laser Weapon System," rafael.co.il. https://www.rafael.co.il/system/iron-beam/</w:t>
+      </w:r>
+    </w:p>
+    <w:p>
+      <w:r>
+        <w:t>[L3] Army Recognition, "Israel's Rafael upgrades its Trophy active protection system to counter kamikaze drones," January 2025. https://www.armyrecognition.com/news/army-news/2025/israels-rafael-upgrades-its-trophy-active-protection-system-to-counter-kamikaze-drones</w:t>
+      </w:r>
+    </w:p>
+    <w:p>
+      <w:r>
+        <w:t>[L4] Breaking Defense, "Rafael rolls out Lite Beam laser, Trophy updates to protect vehicles from drone threats," October 2024. https://breakingdefense.com/2024/10/rafael-rolls-out-lite-beam-laser-trophy-updates-to-protect-vehicles-from-drone-threats/</w:t>
+      </w:r>
+    </w:p>
+    <w:p>
+      <w:r>
+        <w:t>[L5] Ukraine War Analytics, "Counter-Drone Laser Systems in Ukraine 2026: DEW Analysis," ukraine-war-analytics.com. https://ukraine-war-analytics.com/drones/counter-drone-laser-systems-ukraine.html</w:t>
+      </w:r>
+    </w:p>
+    <w:p>
+      <w:r>
+        <w:t>[L6] Robotics.press, "Deployment Report: Directed Energy Counter-UAS Systems," March 2026. https://robotics.press/news/directed-energy-counter-uas-deployment-report/</w:t>
+      </w:r>
+    </w:p>
+    <w:p>
+      <w:r>
+        <w:t>[L7] US GAO, "Directed Energy Weapons: DOD Should Focus on Transition Planning," GAO-23-105868, 2023. https://www.gao.gov/assets/gao-23-105868.pdf</w:t>
+      </w:r>
+    </w:p>
+    <w:p>
+      <w:r>
+        <w:t>[L8] Congressional Research Service, "Department of Defense Directed Energy Weapons: Background and Issues for Congress," R46925. https://www.congress.gov/crs-product/R46925</w:t>
       </w:r>
     </w:p>
     <w:p>
@@ -13339,32 +13339,32 @@
     </w:p>
     <w:p>
       <w:r>
-        <w:t>[W1] Wikipedia, "Barrage balloon" — London curtain defenses stretched 50 miles, cables at 25-yard intervals, 7,000-10,000 ft operational height.</w:t>
-      </w:r>
-    </w:p>
-    <w:p>
-      <w:r>
-        <w:t>[W2] DTIC Report ADA192618, "When the Balloon Goes Up: Barrage Balloons for Low-Level Air Defense" — balloons 500 yards apart, 1,000-foot vertical wires.</w:t>
-      </w:r>
-    </w:p>
-    <w:p>
-      <w:r>
-        <w:t>[W3] VPK.name, "Cut the network once: a new anti-drone system" — Barrier PAK rises to 1,000m, balloons 250-300m apart.</w:t>
-      </w:r>
-    </w:p>
-    <w:p>
-      <w:r>
-        <w:t>[W4] IEEE Spectrum, "Ukraine's Aerostat Revolution Revives Airship Technology" — aerostats as interceptor drone platforms.</w:t>
-      </w:r>
-    </w:p>
-    <w:p>
-      <w:r>
-        <w:t>[W5] The Defense News, "Ukraine Deploys AI-Powered Air Defense System" — MaXon Systems, June 8, 2026.</w:t>
-      </w:r>
-    </w:p>
-    <w:p>
-      <w:r>
-        <w:t>[W6] The War Zone, "Balloon-Launched Drone To Intercept Long Range Kamikaze Drones" — Aerobavovna aerostat system.</w:t>
+        <w:t>[W1] Wikipedia, "Barrage balloon" — London curtain defenses stretched 50 miles, cables at 25-yard intervals, 7,000-10,000 ft operational height. https://en.wikipedia.org/wiki/Barrage_balloon</w:t>
+      </w:r>
+    </w:p>
+    <w:p>
+      <w:r>
+        <w:t>[W2] DTIC Report ADA192618, "When the Balloon Goes Up: Barrage Balloons for Low-Level Air Defense" — balloons 500 yards apart, 1,000-foot vertical wires. https://apps.dtic.mil/sti/tr/pdf/ADA192618.pdf</w:t>
+      </w:r>
+    </w:p>
+    <w:p>
+      <w:r>
+        <w:t>[W3] VPK.name, "Cut the network once: a new anti-drone system" — Barrier PAK rises to 1,000m, balloons 250-300m apart. https://vpk.name/en/888969_cut-the-network-once-a-new-anti-drone-system-has-been-developed.html</w:t>
+      </w:r>
+    </w:p>
+    <w:p>
+      <w:r>
+        <w:t>[W4] IEEE Spectrum, "Ukraine's Aerostat Revolution Revives Airship Technology" — aerostats as interceptor drone platforms. https://spectrum.ieee.org/airships-drones-ukraine</w:t>
+      </w:r>
+    </w:p>
+    <w:p>
+      <w:r>
+        <w:t>[W5] The Defense News, "Ukraine Deploys AI-Powered Air Defense System" — MaXon Systems, June 8, 2026. https://www.thedefensenews.com/Ukraine-Deploys-AI-Powered-Air-Defense-System-That-Automates-95-of-Shahed-Drone-Interceptions/</w:t>
+      </w:r>
+    </w:p>
+    <w:p>
+      <w:r>
+        <w:t>[W6] The War Zone, "Balloon-Launched Drone To Intercept Long Range Kamikaze Drones" — Aerobavovna aerostat system. https://www.twz.com/air/balloon-launched-drone-to-intercept-long-range-kamikaze-drones-emerges-in-ukraine</w:t>
       </w:r>
     </w:p>
     <w:p>
@@ -13564,8 +13564,2767 @@
       </w:r>
     </w:p>
     <w:p>
-      <w:r>
-        <w:t>*[To be populated with results from triple-verification agents]*</w:t>
+      <w:pPr>
+        <w:pStyle w:val="Heading2"/>
+      </w:pPr>
+      <w:r>
+        <w:t>Verification Protocol</w:t>
+      </w:r>
+    </w:p>
+    <w:p>
+      <w:r>
+        <w:t>All references were verified through a triple-verification process using independent AI agents. Each agent independently checked: (1) source existence and accessibility, (2) claim accuracy against the source, (3) cross-referencing with independent sources.</w:t>
+      </w:r>
+    </w:p>
+    <w:p>
+      <w:pPr>
+        <w:pStyle w:val="Heading2"/>
+      </w:pPr>
+      <w:r>
+        <w:t>Reference Verification Results — Batch 1 (Material &amp; Platform Data)</w:t>
+      </w:r>
+    </w:p>
+    <w:tbl>
+      <w:tblPr>
+        <w:tblStyle w:val="TableGrid"/>
+        <w:tblW w:type="auto" w:w="0"/>
+        <w:jc w:val="center"/>
+        <w:tblLook w:firstColumn="1" w:firstRow="1" w:lastColumn="0" w:lastRow="0" w:noHBand="0" w:noVBand="1" w:val="04A0"/>
+      </w:tblPr>
+      <w:tblGrid>
+        <w:gridCol w:w="1872"/>
+        <w:gridCol w:w="1872"/>
+        <w:gridCol w:w="1872"/>
+        <w:gridCol w:w="1872"/>
+        <w:gridCol w:w="1872"/>
+      </w:tblGrid>
+      <w:tr>
+        <w:tc>
+          <w:tcPr>
+            <w:tcW w:type="dxa" w:w="1872"/>
+          </w:tcPr>
+          <w:p>
+            <w:r>
+              <w:rPr>
+                <w:b/>
+                <w:sz w:val="18"/>
+              </w:rPr>
+              <w:t>Ref</w:t>
+            </w:r>
+          </w:p>
+        </w:tc>
+        <w:tc>
+          <w:tcPr>
+            <w:tcW w:type="dxa" w:w="1872"/>
+          </w:tcPr>
+          <w:p>
+            <w:r>
+              <w:rPr>
+                <w:b/>
+                <w:sz w:val="18"/>
+              </w:rPr>
+              <w:t>Claim</w:t>
+            </w:r>
+          </w:p>
+        </w:tc>
+        <w:tc>
+          <w:tcPr>
+            <w:tcW w:type="dxa" w:w="1872"/>
+          </w:tcPr>
+          <w:p>
+            <w:r>
+              <w:rPr>
+                <w:b/>
+                <w:sz w:val="18"/>
+              </w:rPr>
+              <w:t>Status</w:t>
+            </w:r>
+          </w:p>
+        </w:tc>
+        <w:tc>
+          <w:tcPr>
+            <w:tcW w:type="dxa" w:w="1872"/>
+          </w:tcPr>
+          <w:p>
+            <w:r>
+              <w:rPr>
+                <w:b/>
+                <w:sz w:val="18"/>
+              </w:rPr>
+              <w:t>Confidence</w:t>
+            </w:r>
+          </w:p>
+        </w:tc>
+        <w:tc>
+          <w:tcPr>
+            <w:tcW w:type="dxa" w:w="1872"/>
+          </w:tcPr>
+          <w:p>
+            <w:r>
+              <w:rPr>
+                <w:b/>
+                <w:sz w:val="18"/>
+              </w:rPr>
+              <w:t>Notes</w:t>
+            </w:r>
+          </w:p>
+        </w:tc>
+      </w:tr>
+      <w:tr>
+        <w:tc>
+          <w:tcPr>
+            <w:tcW w:type="dxa" w:w="1872"/>
+          </w:tcPr>
+          <w:p>
+            <w:r>
+              <w:rPr>
+                <w:sz w:val="18"/>
+              </w:rPr>
+              <w:t>M1</w:t>
+            </w:r>
+          </w:p>
+        </w:tc>
+        <w:tc>
+          <w:tcPr>
+            <w:tcW w:type="dxa" w:w="1872"/>
+          </w:tcPr>
+          <w:p>
+            <w:r>
+              <w:rPr>
+                <w:sz w:val="18"/>
+              </w:rPr>
+              <w:t>CF mesh 20mm grid: 140-160 g/sqm</w:t>
+            </w:r>
+          </w:p>
+        </w:tc>
+        <w:tc>
+          <w:tcPr>
+            <w:tcW w:type="dxa" w:w="1872"/>
+          </w:tcPr>
+          <w:p>
+            <w:r>
+              <w:rPr>
+                <w:sz w:val="18"/>
+              </w:rPr>
+              <w:t>VERIFIED</w:t>
+            </w:r>
+          </w:p>
+        </w:tc>
+        <w:tc>
+          <w:tcPr>
+            <w:tcW w:type="dxa" w:w="1872"/>
+          </w:tcPr>
+          <w:p>
+            <w:r>
+              <w:rPr>
+                <w:sz w:val="18"/>
+              </w:rPr>
+              <w:t>9/10</w:t>
+            </w:r>
+          </w:p>
+        </w:tc>
+        <w:tc>
+          <w:tcPr>
+            <w:tcW w:type="dxa" w:w="1872"/>
+          </w:tcPr>
+          <w:p>
+            <w:r>
+              <w:rPr>
+                <w:sz w:val="18"/>
+              </w:rPr>
+              <w:t>Confirmed by manufacturer specs (HIT-2020: 142 g/sqm)</w:t>
+            </w:r>
+          </w:p>
+        </w:tc>
+      </w:tr>
+      <w:tr>
+        <w:tc>
+          <w:tcPr>
+            <w:tcW w:type="dxa" w:w="1872"/>
+          </w:tcPr>
+          <w:p>
+            <w:r>
+              <w:rPr>
+                <w:sz w:val="18"/>
+              </w:rPr>
+              <w:t>M2</w:t>
+            </w:r>
+          </w:p>
+        </w:tc>
+        <w:tc>
+          <w:tcPr>
+            <w:tcW w:type="dxa" w:w="1872"/>
+          </w:tcPr>
+          <w:p>
+            <w:r>
+              <w:rPr>
+                <w:sz w:val="18"/>
+              </w:rPr>
+              <w:t>CF mesh costs $4-10/sqm bulk</w:t>
+            </w:r>
+          </w:p>
+        </w:tc>
+        <w:tc>
+          <w:tcPr>
+            <w:tcW w:type="dxa" w:w="1872"/>
+          </w:tcPr>
+          <w:p>
+            <w:r>
+              <w:rPr>
+                <w:sz w:val="18"/>
+              </w:rPr>
+              <w:t>VERIFIED</w:t>
+            </w:r>
+          </w:p>
+        </w:tc>
+        <w:tc>
+          <w:tcPr>
+            <w:tcW w:type="dxa" w:w="1872"/>
+          </w:tcPr>
+          <w:p>
+            <w:r>
+              <w:rPr>
+                <w:sz w:val="18"/>
+              </w:rPr>
+              <w:t>9/10</w:t>
+            </w:r>
+          </w:p>
+        </w:tc>
+        <w:tc>
+          <w:tcPr>
+            <w:tcW w:type="dxa" w:w="1872"/>
+          </w:tcPr>
+          <w:p>
+            <w:r>
+              <w:rPr>
+                <w:sz w:val="18"/>
+              </w:rPr>
+              <w:t>Multiple manufacturers confirm range</w:t>
+            </w:r>
+          </w:p>
+        </w:tc>
+      </w:tr>
+      <w:tr>
+        <w:tc>
+          <w:tcPr>
+            <w:tcW w:type="dxa" w:w="1872"/>
+          </w:tcPr>
+          <w:p>
+            <w:r>
+              <w:rPr>
+                <w:sz w:val="18"/>
+              </w:rPr>
+              <w:t>M3</w:t>
+            </w:r>
+          </w:p>
+        </w:tc>
+        <w:tc>
+          <w:tcPr>
+            <w:tcW w:type="dxa" w:w="1872"/>
+          </w:tcPr>
+          <w:p>
+            <w:r>
+              <w:rPr>
+                <w:sz w:val="18"/>
+              </w:rPr>
+              <w:t>CF tensile strength ≥3,000 MPa</w:t>
+            </w:r>
+          </w:p>
+        </w:tc>
+        <w:tc>
+          <w:tcPr>
+            <w:tcW w:type="dxa" w:w="1872"/>
+          </w:tcPr>
+          <w:p>
+            <w:r>
+              <w:rPr>
+                <w:sz w:val="18"/>
+              </w:rPr>
+              <w:t>VERIFIED</w:t>
+            </w:r>
+          </w:p>
+        </w:tc>
+        <w:tc>
+          <w:tcPr>
+            <w:tcW w:type="dxa" w:w="1872"/>
+          </w:tcPr>
+          <w:p>
+            <w:r>
+              <w:rPr>
+                <w:sz w:val="18"/>
+              </w:rPr>
+              <w:t>10/10</w:t>
+            </w:r>
+          </w:p>
+        </w:tc>
+        <w:tc>
+          <w:tcPr>
+            <w:tcW w:type="dxa" w:w="1872"/>
+          </w:tcPr>
+          <w:p>
+            <w:r>
+              <w:rPr>
+                <w:sz w:val="18"/>
+              </w:rPr>
+              <w:t>ASTM D3039 standard, multiple TDS confirm</w:t>
+            </w:r>
+          </w:p>
+        </w:tc>
+      </w:tr>
+      <w:tr>
+        <w:tc>
+          <w:tcPr>
+            <w:tcW w:type="dxa" w:w="1872"/>
+          </w:tcPr>
+          <w:p>
+            <w:r>
+              <w:rPr>
+                <w:sz w:val="18"/>
+              </w:rPr>
+              <w:t>A1</w:t>
+            </w:r>
+          </w:p>
+        </w:tc>
+        <w:tc>
+          <w:tcPr>
+            <w:tcW w:type="dxa" w:w="1872"/>
+          </w:tcPr>
+          <w:p>
+            <w:r>
+              <w:rPr>
+                <w:sz w:val="18"/>
+              </w:rPr>
+              <w:t>Airlander 10: 10t payload, 6,096m, 5 days</w:t>
+            </w:r>
+          </w:p>
+        </w:tc>
+        <w:tc>
+          <w:tcPr>
+            <w:tcW w:type="dxa" w:w="1872"/>
+          </w:tcPr>
+          <w:p>
+            <w:r>
+              <w:rPr>
+                <w:sz w:val="18"/>
+              </w:rPr>
+              <w:t>VERIFIED</w:t>
+            </w:r>
+          </w:p>
+        </w:tc>
+        <w:tc>
+          <w:tcPr>
+            <w:tcW w:type="dxa" w:w="1872"/>
+          </w:tcPr>
+          <w:p>
+            <w:r>
+              <w:rPr>
+                <w:sz w:val="18"/>
+              </w:rPr>
+              <w:t>10/10</w:t>
+            </w:r>
+          </w:p>
+        </w:tc>
+        <w:tc>
+          <w:tcPr>
+            <w:tcW w:type="dxa" w:w="1872"/>
+          </w:tcPr>
+          <w:p>
+            <w:r>
+              <w:rPr>
+                <w:sz w:val="18"/>
+              </w:rPr>
+              <w:t>HAV official specifications confirmed</w:t>
+            </w:r>
+          </w:p>
+        </w:tc>
+      </w:tr>
+      <w:tr>
+        <w:tc>
+          <w:tcPr>
+            <w:tcW w:type="dxa" w:w="1872"/>
+          </w:tcPr>
+          <w:p>
+            <w:r>
+              <w:rPr>
+                <w:sz w:val="18"/>
+              </w:rPr>
+              <w:t>A3</w:t>
+            </w:r>
+          </w:p>
+        </w:tc>
+        <w:tc>
+          <w:tcPr>
+            <w:tcW w:type="dxa" w:w="1872"/>
+          </w:tcPr>
+          <w:p>
+            <w:r>
+              <w:rPr>
+                <w:sz w:val="18"/>
+              </w:rPr>
+              <w:t>Zeppelin NT: 1,900 kg payload, 3,000m</w:t>
+            </w:r>
+          </w:p>
+        </w:tc>
+        <w:tc>
+          <w:tcPr>
+            <w:tcW w:type="dxa" w:w="1872"/>
+          </w:tcPr>
+          <w:p>
+            <w:r>
+              <w:rPr>
+                <w:sz w:val="18"/>
+              </w:rPr>
+              <w:t>PARTIALLY VERIFIED</w:t>
+            </w:r>
+          </w:p>
+        </w:tc>
+        <w:tc>
+          <w:tcPr>
+            <w:tcW w:type="dxa" w:w="1872"/>
+          </w:tcPr>
+          <w:p>
+            <w:r>
+              <w:rPr>
+                <w:sz w:val="18"/>
+              </w:rPr>
+              <w:t>8/10</w:t>
+            </w:r>
+          </w:p>
+        </w:tc>
+        <w:tc>
+          <w:tcPr>
+            <w:tcW w:type="dxa" w:w="1872"/>
+          </w:tcPr>
+          <w:p>
+            <w:r>
+              <w:rPr>
+                <w:sz w:val="18"/>
+              </w:rPr>
+              <w:t>Corrected from 1,950 to 1,900 kg per official data</w:t>
+            </w:r>
+          </w:p>
+        </w:tc>
+      </w:tr>
+      <w:tr>
+        <w:tc>
+          <w:tcPr>
+            <w:tcW w:type="dxa" w:w="1872"/>
+          </w:tcPr>
+          <w:p>
+            <w:r>
+              <w:rPr>
+                <w:sz w:val="18"/>
+              </w:rPr>
+              <w:t>A4</w:t>
+            </w:r>
+          </w:p>
+        </w:tc>
+        <w:tc>
+          <w:tcPr>
+            <w:tcW w:type="dxa" w:w="1872"/>
+          </w:tcPr>
+          <w:p>
+            <w:r>
+              <w:rPr>
+                <w:sz w:val="18"/>
+              </w:rPr>
+              <w:t>Kelluu: €15M Series A, NATO Innovation Fund</w:t>
+            </w:r>
+          </w:p>
+        </w:tc>
+        <w:tc>
+          <w:tcPr>
+            <w:tcW w:type="dxa" w:w="1872"/>
+          </w:tcPr>
+          <w:p>
+            <w:r>
+              <w:rPr>
+                <w:sz w:val="18"/>
+              </w:rPr>
+              <w:t>VERIFIED</w:t>
+            </w:r>
+          </w:p>
+        </w:tc>
+        <w:tc>
+          <w:tcPr>
+            <w:tcW w:type="dxa" w:w="1872"/>
+          </w:tcPr>
+          <w:p>
+            <w:r>
+              <w:rPr>
+                <w:sz w:val="18"/>
+              </w:rPr>
+              <w:t>9/10</w:t>
+            </w:r>
+          </w:p>
+        </w:tc>
+        <w:tc>
+          <w:tcPr>
+            <w:tcW w:type="dxa" w:w="1872"/>
+          </w:tcPr>
+          <w:p>
+            <w:r>
+              <w:rPr>
+                <w:sz w:val="18"/>
+              </w:rPr>
+              <w:t>TechFundingNews confirms details</w:t>
+            </w:r>
+          </w:p>
+        </w:tc>
+      </w:tr>
+      <w:tr>
+        <w:tc>
+          <w:tcPr>
+            <w:tcW w:type="dxa" w:w="1872"/>
+          </w:tcPr>
+          <w:p>
+            <w:r>
+              <w:rPr>
+                <w:sz w:val="18"/>
+              </w:rPr>
+              <w:t>A6</w:t>
+            </w:r>
+          </w:p>
+        </w:tc>
+        <w:tc>
+          <w:tcPr>
+            <w:tcW w:type="dxa" w:w="1872"/>
+          </w:tcPr>
+          <w:p>
+            <w:r>
+              <w:rPr>
+                <w:sz w:val="18"/>
+              </w:rPr>
+              <w:t>TCOM 74K: 500 kg, 1,500m, up to 30 days</w:t>
+            </w:r>
+          </w:p>
+        </w:tc>
+        <w:tc>
+          <w:tcPr>
+            <w:tcW w:type="dxa" w:w="1872"/>
+          </w:tcPr>
+          <w:p>
+            <w:r>
+              <w:rPr>
+                <w:sz w:val="18"/>
+              </w:rPr>
+              <w:t>PARTIALLY VERIFIED</w:t>
+            </w:r>
+          </w:p>
+        </w:tc>
+        <w:tc>
+          <w:tcPr>
+            <w:tcW w:type="dxa" w:w="1872"/>
+          </w:tcPr>
+          <w:p>
+            <w:r>
+              <w:rPr>
+                <w:sz w:val="18"/>
+              </w:rPr>
+              <w:t>8/10</w:t>
+            </w:r>
+          </w:p>
+        </w:tc>
+        <w:tc>
+          <w:tcPr>
+            <w:tcW w:type="dxa" w:w="1872"/>
+          </w:tcPr>
+          <w:p>
+            <w:r>
+              <w:rPr>
+                <w:sz w:val="18"/>
+              </w:rPr>
+              <w:t>Endurance may be ~20 days operationally</w:t>
+            </w:r>
+          </w:p>
+        </w:tc>
+      </w:tr>
+      <w:tr>
+        <w:tc>
+          <w:tcPr>
+            <w:tcW w:type="dxa" w:w="1872"/>
+          </w:tcPr>
+          <w:p>
+            <w:r>
+              <w:rPr>
+                <w:sz w:val="18"/>
+              </w:rPr>
+              <w:t>A7</w:t>
+            </w:r>
+          </w:p>
+        </w:tc>
+        <w:tc>
+          <w:tcPr>
+            <w:tcW w:type="dxa" w:w="1872"/>
+          </w:tcPr>
+          <w:p>
+            <w:r>
+              <w:rPr>
+                <w:sz w:val="18"/>
+              </w:rPr>
+              <w:t>Flying Whales LCA60T: 60t payload</w:t>
+            </w:r>
+          </w:p>
+        </w:tc>
+        <w:tc>
+          <w:tcPr>
+            <w:tcW w:type="dxa" w:w="1872"/>
+          </w:tcPr>
+          <w:p>
+            <w:r>
+              <w:rPr>
+                <w:sz w:val="18"/>
+              </w:rPr>
+              <w:t>VERIFIED</w:t>
+            </w:r>
+          </w:p>
+        </w:tc>
+        <w:tc>
+          <w:tcPr>
+            <w:tcW w:type="dxa" w:w="1872"/>
+          </w:tcPr>
+          <w:p>
+            <w:r>
+              <w:rPr>
+                <w:sz w:val="18"/>
+              </w:rPr>
+              <w:t>10/10</w:t>
+            </w:r>
+          </w:p>
+        </w:tc>
+        <w:tc>
+          <w:tcPr>
+            <w:tcW w:type="dxa" w:w="1872"/>
+          </w:tcPr>
+          <w:p>
+            <w:r>
+              <w:rPr>
+                <w:sz w:val="18"/>
+              </w:rPr>
+              <w:t>Heavy Lift PFI article confirms</w:t>
+            </w:r>
+          </w:p>
+        </w:tc>
+      </w:tr>
+      <w:tr>
+        <w:tc>
+          <w:tcPr>
+            <w:tcW w:type="dxa" w:w="1872"/>
+          </w:tcPr>
+          <w:p>
+            <w:r>
+              <w:rPr>
+                <w:sz w:val="18"/>
+              </w:rPr>
+              <w:t>A8</w:t>
+            </w:r>
+          </w:p>
+        </w:tc>
+        <w:tc>
+          <w:tcPr>
+            <w:tcW w:type="dxa" w:w="1872"/>
+          </w:tcPr>
+          <w:p>
+            <w:r>
+              <w:rPr>
+                <w:sz w:val="18"/>
+              </w:rPr>
+              <w:t>TARS 420K: 1,000+ kg payload, 4,600m</w:t>
+            </w:r>
+          </w:p>
+        </w:tc>
+        <w:tc>
+          <w:tcPr>
+            <w:tcW w:type="dxa" w:w="1872"/>
+          </w:tcPr>
+          <w:p>
+            <w:r>
+              <w:rPr>
+                <w:sz w:val="18"/>
+              </w:rPr>
+              <w:t>PARTIALLY VERIFIED</w:t>
+            </w:r>
+          </w:p>
+        </w:tc>
+        <w:tc>
+          <w:tcPr>
+            <w:tcW w:type="dxa" w:w="1872"/>
+          </w:tcPr>
+          <w:p>
+            <w:r>
+              <w:rPr>
+                <w:sz w:val="18"/>
+              </w:rPr>
+              <w:t>7/10</w:t>
+            </w:r>
+          </w:p>
+        </w:tc>
+        <w:tc>
+          <w:tcPr>
+            <w:tcW w:type="dxa" w:w="1872"/>
+          </w:tcPr>
+          <w:p>
+            <w:r>
+              <w:rPr>
+                <w:sz w:val="18"/>
+              </w:rPr>
+              <w:t>Payload corrected from 1,200+ to 1,000+ kg</w:t>
+            </w:r>
+          </w:p>
+        </w:tc>
+      </w:tr>
+    </w:tbl>
+    <w:p/>
+    <w:p>
+      <w:pPr>
+        <w:pStyle w:val="Heading2"/>
+      </w:pPr>
+      <w:r>
+        <w:t>Reference Verification Results — Batch 2 (Threat &amp; Combat Data)</w:t>
+      </w:r>
+    </w:p>
+    <w:tbl>
+      <w:tblPr>
+        <w:tblStyle w:val="TableGrid"/>
+        <w:tblW w:type="auto" w:w="0"/>
+        <w:jc w:val="center"/>
+        <w:tblLook w:firstColumn="1" w:firstRow="1" w:lastColumn="0" w:lastRow="0" w:noHBand="0" w:noVBand="1" w:val="04A0"/>
+      </w:tblPr>
+      <w:tblGrid>
+        <w:gridCol w:w="1872"/>
+        <w:gridCol w:w="1872"/>
+        <w:gridCol w:w="1872"/>
+        <w:gridCol w:w="1872"/>
+        <w:gridCol w:w="1872"/>
+      </w:tblGrid>
+      <w:tr>
+        <w:tc>
+          <w:tcPr>
+            <w:tcW w:type="dxa" w:w="1872"/>
+          </w:tcPr>
+          <w:p>
+            <w:r>
+              <w:rPr>
+                <w:b/>
+                <w:sz w:val="18"/>
+              </w:rPr>
+              <w:t>Ref</w:t>
+            </w:r>
+          </w:p>
+        </w:tc>
+        <w:tc>
+          <w:tcPr>
+            <w:tcW w:type="dxa" w:w="1872"/>
+          </w:tcPr>
+          <w:p>
+            <w:r>
+              <w:rPr>
+                <w:b/>
+                <w:sz w:val="18"/>
+              </w:rPr>
+              <w:t>Claim</w:t>
+            </w:r>
+          </w:p>
+        </w:tc>
+        <w:tc>
+          <w:tcPr>
+            <w:tcW w:type="dxa" w:w="1872"/>
+          </w:tcPr>
+          <w:p>
+            <w:r>
+              <w:rPr>
+                <w:b/>
+                <w:sz w:val="18"/>
+              </w:rPr>
+              <w:t>Status</w:t>
+            </w:r>
+          </w:p>
+        </w:tc>
+        <w:tc>
+          <w:tcPr>
+            <w:tcW w:type="dxa" w:w="1872"/>
+          </w:tcPr>
+          <w:p>
+            <w:r>
+              <w:rPr>
+                <w:b/>
+                <w:sz w:val="18"/>
+              </w:rPr>
+              <w:t>Confidence</w:t>
+            </w:r>
+          </w:p>
+        </w:tc>
+        <w:tc>
+          <w:tcPr>
+            <w:tcW w:type="dxa" w:w="1872"/>
+          </w:tcPr>
+          <w:p>
+            <w:r>
+              <w:rPr>
+                <w:b/>
+                <w:sz w:val="18"/>
+              </w:rPr>
+              <w:t>Notes</w:t>
+            </w:r>
+          </w:p>
+        </w:tc>
+      </w:tr>
+      <w:tr>
+        <w:tc>
+          <w:tcPr>
+            <w:tcW w:type="dxa" w:w="1872"/>
+          </w:tcPr>
+          <w:p>
+            <w:r>
+              <w:rPr>
+                <w:sz w:val="18"/>
+              </w:rPr>
+              <w:t>T1</w:t>
+            </w:r>
+          </w:p>
+        </w:tc>
+        <w:tc>
+          <w:tcPr>
+            <w:tcW w:type="dxa" w:w="1872"/>
+          </w:tcPr>
+          <w:p>
+            <w:r>
+              <w:rPr>
+                <w:sz w:val="18"/>
+              </w:rPr>
+              <w:t>Shahed low-altitude: 30-500m AGL</w:t>
+            </w:r>
+          </w:p>
+        </w:tc>
+        <w:tc>
+          <w:tcPr>
+            <w:tcW w:type="dxa" w:w="1872"/>
+          </w:tcPr>
+          <w:p>
+            <w:r>
+              <w:rPr>
+                <w:sz w:val="18"/>
+              </w:rPr>
+              <w:t>VERIFIED</w:t>
+            </w:r>
+          </w:p>
+        </w:tc>
+        <w:tc>
+          <w:tcPr>
+            <w:tcW w:type="dxa" w:w="1872"/>
+          </w:tcPr>
+          <w:p>
+            <w:r>
+              <w:rPr>
+                <w:sz w:val="18"/>
+              </w:rPr>
+              <w:t>9/10</w:t>
+            </w:r>
+          </w:p>
+        </w:tc>
+        <w:tc>
+          <w:tcPr>
+            <w:tcW w:type="dxa" w:w="1872"/>
+          </w:tcPr>
+          <w:p>
+            <w:r>
+              <w:rPr>
+                <w:sz w:val="18"/>
+              </w:rPr>
+              <w:t>Corrected from 30-200m to 30-500m per source</w:t>
+            </w:r>
+          </w:p>
+        </w:tc>
+      </w:tr>
+      <w:tr>
+        <w:tc>
+          <w:tcPr>
+            <w:tcW w:type="dxa" w:w="1872"/>
+          </w:tcPr>
+          <w:p>
+            <w:r>
+              <w:rPr>
+                <w:sz w:val="18"/>
+              </w:rPr>
+              <w:t>T4</w:t>
+            </w:r>
+          </w:p>
+        </w:tc>
+        <w:tc>
+          <w:tcPr>
+            <w:tcW w:type="dxa" w:w="1872"/>
+          </w:tcPr>
+          <w:p>
+            <w:r>
+              <w:rPr>
+                <w:sz w:val="18"/>
+              </w:rPr>
+              <w:t>Kh-101: 30-70m cruise, Mach 0.78, 3,500 km</w:t>
+            </w:r>
+          </w:p>
+        </w:tc>
+        <w:tc>
+          <w:tcPr>
+            <w:tcW w:type="dxa" w:w="1872"/>
+          </w:tcPr>
+          <w:p>
+            <w:r>
+              <w:rPr>
+                <w:sz w:val="18"/>
+              </w:rPr>
+              <w:t>VERIFIED</w:t>
+            </w:r>
+          </w:p>
+        </w:tc>
+        <w:tc>
+          <w:tcPr>
+            <w:tcW w:type="dxa" w:w="1872"/>
+          </w:tcPr>
+          <w:p>
+            <w:r>
+              <w:rPr>
+                <w:sz w:val="18"/>
+              </w:rPr>
+              <w:t>10/10</w:t>
+            </w:r>
+          </w:p>
+        </w:tc>
+        <w:tc>
+          <w:tcPr>
+            <w:tcW w:type="dxa" w:w="1872"/>
+          </w:tcPr>
+          <w:p>
+            <w:r>
+              <w:rPr>
+                <w:sz w:val="18"/>
+              </w:rPr>
+              <w:t>Wikipedia + CSIS both confirm</w:t>
+            </w:r>
+          </w:p>
+        </w:tc>
+      </w:tr>
+      <w:tr>
+        <w:tc>
+          <w:tcPr>
+            <w:tcW w:type="dxa" w:w="1872"/>
+          </w:tcPr>
+          <w:p>
+            <w:r>
+              <w:rPr>
+                <w:sz w:val="18"/>
+              </w:rPr>
+              <w:t>T6</w:t>
+            </w:r>
+          </w:p>
+        </w:tc>
+        <w:tc>
+          <w:tcPr>
+            <w:tcW w:type="dxa" w:w="1872"/>
+          </w:tcPr>
+          <w:p>
+            <w:r>
+              <w:rPr>
+                <w:sz w:val="18"/>
+              </w:rPr>
+              <w:t>Kalibr: 50-150m land, 20m sea, filmed at 65-80m</w:t>
+            </w:r>
+          </w:p>
+        </w:tc>
+        <w:tc>
+          <w:tcPr>
+            <w:tcW w:type="dxa" w:w="1872"/>
+          </w:tcPr>
+          <w:p>
+            <w:r>
+              <w:rPr>
+                <w:sz w:val="18"/>
+              </w:rPr>
+              <w:t>VERIFIED</w:t>
+            </w:r>
+          </w:p>
+        </w:tc>
+        <w:tc>
+          <w:tcPr>
+            <w:tcW w:type="dxa" w:w="1872"/>
+          </w:tcPr>
+          <w:p>
+            <w:r>
+              <w:rPr>
+                <w:sz w:val="18"/>
+              </w:rPr>
+              <w:t>10/10</w:t>
+            </w:r>
+          </w:p>
+        </w:tc>
+        <w:tc>
+          <w:tcPr>
+            <w:tcW w:type="dxa" w:w="1872"/>
+          </w:tcPr>
+          <w:p>
+            <w:r>
+              <w:rPr>
+                <w:sz w:val="18"/>
+              </w:rPr>
+              <w:t>Multiple sources confirm</w:t>
+            </w:r>
+          </w:p>
+        </w:tc>
+      </w:tr>
+      <w:tr>
+        <w:tc>
+          <w:tcPr>
+            <w:tcW w:type="dxa" w:w="1872"/>
+          </w:tcPr>
+          <w:p>
+            <w:r>
+              <w:rPr>
+                <w:sz w:val="18"/>
+              </w:rPr>
+              <w:t>T10</w:t>
+            </w:r>
+          </w:p>
+        </w:tc>
+        <w:tc>
+          <w:tcPr>
+            <w:tcW w:type="dxa" w:w="1872"/>
+          </w:tcPr>
+          <w:p>
+            <w:r>
+              <w:rPr>
+                <w:sz w:val="18"/>
+              </w:rPr>
+              <w:t>Hezbollah fiber-optic FPV: immune to jamming, 9-15 km</w:t>
+            </w:r>
+          </w:p>
+        </w:tc>
+        <w:tc>
+          <w:tcPr>
+            <w:tcW w:type="dxa" w:w="1872"/>
+          </w:tcPr>
+          <w:p>
+            <w:r>
+              <w:rPr>
+                <w:sz w:val="18"/>
+              </w:rPr>
+              <w:t>VERIFIED</w:t>
+            </w:r>
+          </w:p>
+        </w:tc>
+        <w:tc>
+          <w:tcPr>
+            <w:tcW w:type="dxa" w:w="1872"/>
+          </w:tcPr>
+          <w:p>
+            <w:r>
+              <w:rPr>
+                <w:sz w:val="18"/>
+              </w:rPr>
+              <w:t>10/10</w:t>
+            </w:r>
+          </w:p>
+        </w:tc>
+        <w:tc>
+          <w:tcPr>
+            <w:tcW w:type="dxa" w:w="1872"/>
+          </w:tcPr>
+          <w:p>
+            <w:r>
+              <w:rPr>
+                <w:sz w:val="18"/>
+              </w:rPr>
+              <w:t>CNN, Defense News, Foreign Policy all confirm</w:t>
+            </w:r>
+          </w:p>
+        </w:tc>
+      </w:tr>
+      <w:tr>
+        <w:tc>
+          <w:tcPr>
+            <w:tcW w:type="dxa" w:w="1872"/>
+          </w:tcPr>
+          <w:p>
+            <w:r>
+              <w:rPr>
+                <w:sz w:val="18"/>
+              </w:rPr>
+              <w:t>G1</w:t>
+            </w:r>
+          </w:p>
+        </w:tc>
+        <w:tc>
+          <w:tcPr>
+            <w:tcW w:type="dxa" w:w="1872"/>
+          </w:tcPr>
+          <w:p>
+            <w:r>
+              <w:rPr>
+                <w:sz w:val="18"/>
+              </w:rPr>
+              <w:t>Israel-Lebanon border: 79 km</w:t>
+            </w:r>
+          </w:p>
+        </w:tc>
+        <w:tc>
+          <w:tcPr>
+            <w:tcW w:type="dxa" w:w="1872"/>
+          </w:tcPr>
+          <w:p>
+            <w:r>
+              <w:rPr>
+                <w:sz w:val="18"/>
+              </w:rPr>
+              <w:t>VERIFIED</w:t>
+            </w:r>
+          </w:p>
+        </w:tc>
+        <w:tc>
+          <w:tcPr>
+            <w:tcW w:type="dxa" w:w="1872"/>
+          </w:tcPr>
+          <w:p>
+            <w:r>
+              <w:rPr>
+                <w:sz w:val="18"/>
+              </w:rPr>
+              <w:t>9/10</w:t>
+            </w:r>
+          </w:p>
+        </w:tc>
+        <w:tc>
+          <w:tcPr>
+            <w:tcW w:type="dxa" w:w="1872"/>
+          </w:tcPr>
+          <w:p>
+            <w:r>
+              <w:rPr>
+                <w:sz w:val="18"/>
+              </w:rPr>
+              <w:t>Wikipedia Geography of Lebanon confirms</w:t>
+            </w:r>
+          </w:p>
+        </w:tc>
+      </w:tr>
+      <w:tr>
+        <w:tc>
+          <w:tcPr>
+            <w:tcW w:type="dxa" w:w="1872"/>
+          </w:tcPr>
+          <w:p>
+            <w:r>
+              <w:rPr>
+                <w:sz w:val="18"/>
+              </w:rPr>
+              <w:t>G4</w:t>
+            </w:r>
+          </w:p>
+        </w:tc>
+        <w:tc>
+          <w:tcPr>
+            <w:tcW w:type="dxa" w:w="1872"/>
+          </w:tcPr>
+          <w:p>
+            <w:r>
+              <w:rPr>
+                <w:sz w:val="18"/>
+              </w:rPr>
+              <w:t>Golan Heights: 65 km N-S, 12-25 km E-W</w:t>
+            </w:r>
+          </w:p>
+        </w:tc>
+        <w:tc>
+          <w:tcPr>
+            <w:tcW w:type="dxa" w:w="1872"/>
+          </w:tcPr>
+          <w:p>
+            <w:r>
+              <w:rPr>
+                <w:sz w:val="18"/>
+              </w:rPr>
+              <w:t>VERIFIED</w:t>
+            </w:r>
+          </w:p>
+        </w:tc>
+        <w:tc>
+          <w:tcPr>
+            <w:tcW w:type="dxa" w:w="1872"/>
+          </w:tcPr>
+          <w:p>
+            <w:r>
+              <w:rPr>
+                <w:sz w:val="18"/>
+              </w:rPr>
+              <w:t>10/10</w:t>
+            </w:r>
+          </w:p>
+        </w:tc>
+        <w:tc>
+          <w:tcPr>
+            <w:tcW w:type="dxa" w:w="1872"/>
+          </w:tcPr>
+          <w:p>
+            <w:r>
+              <w:rPr>
+                <w:sz w:val="18"/>
+              </w:rPr>
+              <w:t>Multiple encyclopedias confirm</w:t>
+            </w:r>
+          </w:p>
+        </w:tc>
+      </w:tr>
+      <w:tr>
+        <w:tc>
+          <w:tcPr>
+            <w:tcW w:type="dxa" w:w="1872"/>
+          </w:tcPr>
+          <w:p>
+            <w:r>
+              <w:rPr>
+                <w:sz w:val="18"/>
+              </w:rPr>
+              <w:t>G6</w:t>
+            </w:r>
+          </w:p>
+        </w:tc>
+        <w:tc>
+          <w:tcPr>
+            <w:tcW w:type="dxa" w:w="1872"/>
+          </w:tcPr>
+          <w:p>
+            <w:r>
+              <w:rPr>
+                <w:sz w:val="18"/>
+              </w:rPr>
+              <w:t>Israel-Jordan border: 482 km</w:t>
+            </w:r>
+          </w:p>
+        </w:tc>
+        <w:tc>
+          <w:tcPr>
+            <w:tcW w:type="dxa" w:w="1872"/>
+          </w:tcPr>
+          <w:p>
+            <w:r>
+              <w:rPr>
+                <w:sz w:val="18"/>
+              </w:rPr>
+              <w:t>VERIFIED</w:t>
+            </w:r>
+          </w:p>
+        </w:tc>
+        <w:tc>
+          <w:tcPr>
+            <w:tcW w:type="dxa" w:w="1872"/>
+          </w:tcPr>
+          <w:p>
+            <w:r>
+              <w:rPr>
+                <w:sz w:val="18"/>
+              </w:rPr>
+              <w:t>10/10</w:t>
+            </w:r>
+          </w:p>
+        </w:tc>
+        <w:tc>
+          <w:tcPr>
+            <w:tcW w:type="dxa" w:w="1872"/>
+          </w:tcPr>
+          <w:p>
+            <w:r>
+              <w:rPr>
+                <w:sz w:val="18"/>
+              </w:rPr>
+              <w:t>Sovereign Limits confirms</w:t>
+            </w:r>
+          </w:p>
+        </w:tc>
+      </w:tr>
+      <w:tr>
+        <w:tc>
+          <w:tcPr>
+            <w:tcW w:type="dxa" w:w="1872"/>
+          </w:tcPr>
+          <w:p>
+            <w:r>
+              <w:rPr>
+                <w:sz w:val="18"/>
+              </w:rPr>
+              <w:t>C3</w:t>
+            </w:r>
+          </w:p>
+        </w:tc>
+        <w:tc>
+          <w:tcPr>
+            <w:tcW w:type="dxa" w:w="1872"/>
+          </w:tcPr>
+          <w:p>
+            <w:r>
+              <w:rPr>
+                <w:sz w:val="18"/>
+              </w:rPr>
+              <w:t>Hezbollah 80+ FPV attacks, 4 KIA</w:t>
+            </w:r>
+          </w:p>
+        </w:tc>
+        <w:tc>
+          <w:tcPr>
+            <w:tcW w:type="dxa" w:w="1872"/>
+          </w:tcPr>
+          <w:p>
+            <w:r>
+              <w:rPr>
+                <w:sz w:val="18"/>
+              </w:rPr>
+              <w:t>VERIFIED</w:t>
+            </w:r>
+          </w:p>
+        </w:tc>
+        <w:tc>
+          <w:tcPr>
+            <w:tcW w:type="dxa" w:w="1872"/>
+          </w:tcPr>
+          <w:p>
+            <w:r>
+              <w:rPr>
+                <w:sz w:val="18"/>
+              </w:rPr>
+              <w:t>9/10</w:t>
+            </w:r>
+          </w:p>
+        </w:tc>
+        <w:tc>
+          <w:tcPr>
+            <w:tcW w:type="dxa" w:w="1872"/>
+          </w:tcPr>
+          <w:p>
+            <w:r>
+              <w:rPr>
+                <w:sz w:val="18"/>
+              </w:rPr>
+              <w:t>Alma Center special report confirms</w:t>
+            </w:r>
+          </w:p>
+        </w:tc>
+      </w:tr>
+      <w:tr>
+        <w:tc>
+          <w:tcPr>
+            <w:tcW w:type="dxa" w:w="1872"/>
+          </w:tcPr>
+          <w:p>
+            <w:r>
+              <w:rPr>
+                <w:sz w:val="18"/>
+              </w:rPr>
+              <w:t>P1</w:t>
+            </w:r>
+          </w:p>
+        </w:tc>
+        <w:tc>
+          <w:tcPr>
+            <w:tcW w:type="dxa" w:w="1872"/>
+          </w:tcPr>
+          <w:p>
+            <w:r>
+              <w:rPr>
+                <w:sz w:val="18"/>
+              </w:rPr>
+              <w:t>PCNS patent EP3769030A1</w:t>
+            </w:r>
+          </w:p>
+        </w:tc>
+        <w:tc>
+          <w:tcPr>
+            <w:tcW w:type="dxa" w:w="1872"/>
+          </w:tcPr>
+          <w:p>
+            <w:r>
+              <w:rPr>
+                <w:sz w:val="18"/>
+              </w:rPr>
+              <w:t>VERIFIED</w:t>
+            </w:r>
+          </w:p>
+        </w:tc>
+        <w:tc>
+          <w:tcPr>
+            <w:tcW w:type="dxa" w:w="1872"/>
+          </w:tcPr>
+          <w:p>
+            <w:r>
+              <w:rPr>
+                <w:sz w:val="18"/>
+              </w:rPr>
+              <w:t>10/10</w:t>
+            </w:r>
+          </w:p>
+        </w:tc>
+        <w:tc>
+          <w:tcPr>
+            <w:tcW w:type="dxa" w:w="1872"/>
+          </w:tcPr>
+          <w:p>
+            <w:r>
+              <w:rPr>
+                <w:sz w:val="18"/>
+              </w:rPr>
+              <w:t>Google Patents confirms existence and content</w:t>
+            </w:r>
+          </w:p>
+        </w:tc>
+      </w:tr>
+      <w:tr>
+        <w:tc>
+          <w:tcPr>
+            <w:tcW w:type="dxa" w:w="1872"/>
+          </w:tcPr>
+          <w:p>
+            <w:r>
+              <w:rPr>
+                <w:sz w:val="18"/>
+              </w:rPr>
+              <w:t>P3</w:t>
+            </w:r>
+          </w:p>
+        </w:tc>
+        <w:tc>
+          <w:tcPr>
+            <w:tcW w:type="dxa" w:w="1872"/>
+          </w:tcPr>
+          <w:p>
+            <w:r>
+              <w:rPr>
+                <w:sz w:val="18"/>
+              </w:rPr>
+              <w:t>AB-Net AIAA 2008-6863, arXiv:0802.1871</w:t>
+            </w:r>
+          </w:p>
+        </w:tc>
+        <w:tc>
+          <w:tcPr>
+            <w:tcW w:type="dxa" w:w="1872"/>
+          </w:tcPr>
+          <w:p>
+            <w:r>
+              <w:rPr>
+                <w:sz w:val="18"/>
+              </w:rPr>
+              <w:t>VERIFIED</w:t>
+            </w:r>
+          </w:p>
+        </w:tc>
+        <w:tc>
+          <w:tcPr>
+            <w:tcW w:type="dxa" w:w="1872"/>
+          </w:tcPr>
+          <w:p>
+            <w:r>
+              <w:rPr>
+                <w:sz w:val="18"/>
+              </w:rPr>
+              <w:t>10/10</w:t>
+            </w:r>
+          </w:p>
+        </w:tc>
+        <w:tc>
+          <w:tcPr>
+            <w:tcW w:type="dxa" w:w="1872"/>
+          </w:tcPr>
+          <w:p>
+            <w:r>
+              <w:rPr>
+                <w:sz w:val="18"/>
+              </w:rPr>
+              <w:t>Both AIAA and arXiv confirm</w:t>
+            </w:r>
+          </w:p>
+        </w:tc>
+      </w:tr>
+      <w:tr>
+        <w:tc>
+          <w:tcPr>
+            <w:tcW w:type="dxa" w:w="1872"/>
+          </w:tcPr>
+          <w:p>
+            <w:r>
+              <w:rPr>
+                <w:sz w:val="18"/>
+              </w:rPr>
+              <w:t>E2</w:t>
+            </w:r>
+          </w:p>
+        </w:tc>
+        <w:tc>
+          <w:tcPr>
+            <w:tcW w:type="dxa" w:w="1872"/>
+          </w:tcPr>
+          <w:p>
+            <w:r>
+              <w:rPr>
+                <w:sz w:val="18"/>
+              </w:rPr>
+              <w:t>ZIRKA interceptor $2,000</w:t>
+            </w:r>
+          </w:p>
+        </w:tc>
+        <w:tc>
+          <w:tcPr>
+            <w:tcW w:type="dxa" w:w="1872"/>
+          </w:tcPr>
+          <w:p>
+            <w:r>
+              <w:rPr>
+                <w:sz w:val="18"/>
+              </w:rPr>
+              <w:t>VERIFIED</w:t>
+            </w:r>
+          </w:p>
+        </w:tc>
+        <w:tc>
+          <w:tcPr>
+            <w:tcW w:type="dxa" w:w="1872"/>
+          </w:tcPr>
+          <w:p>
+            <w:r>
+              <w:rPr>
+                <w:sz w:val="18"/>
+              </w:rPr>
+              <w:t>9/10</w:t>
+            </w:r>
+          </w:p>
+        </w:tc>
+        <w:tc>
+          <w:tcPr>
+            <w:tcW w:type="dxa" w:w="1872"/>
+          </w:tcPr>
+          <w:p>
+            <w:r>
+              <w:rPr>
+                <w:sz w:val="18"/>
+              </w:rPr>
+              <w:t>Euromaidan Press July 2026 confirms</w:t>
+            </w:r>
+          </w:p>
+        </w:tc>
+      </w:tr>
+    </w:tbl>
+    <w:p/>
+    <w:p>
+      <w:pPr>
+        <w:pStyle w:val="Heading2"/>
+      </w:pPr>
+      <w:r>
+        <w:t>Reference Verification Results — Batch 3 (New Content)</w:t>
+      </w:r>
+    </w:p>
+    <w:tbl>
+      <w:tblPr>
+        <w:tblStyle w:val="TableGrid"/>
+        <w:tblW w:type="auto" w:w="0"/>
+        <w:jc w:val="center"/>
+        <w:tblLook w:firstColumn="1" w:firstRow="1" w:lastColumn="0" w:lastRow="0" w:noHBand="0" w:noVBand="1" w:val="04A0"/>
+      </w:tblPr>
+      <w:tblGrid>
+        <w:gridCol w:w="1872"/>
+        <w:gridCol w:w="1872"/>
+        <w:gridCol w:w="1872"/>
+        <w:gridCol w:w="1872"/>
+        <w:gridCol w:w="1872"/>
+      </w:tblGrid>
+      <w:tr>
+        <w:tc>
+          <w:tcPr>
+            <w:tcW w:type="dxa" w:w="1872"/>
+          </w:tcPr>
+          <w:p>
+            <w:r>
+              <w:rPr>
+                <w:b/>
+                <w:sz w:val="18"/>
+              </w:rPr>
+              <w:t>Ref</w:t>
+            </w:r>
+          </w:p>
+        </w:tc>
+        <w:tc>
+          <w:tcPr>
+            <w:tcW w:type="dxa" w:w="1872"/>
+          </w:tcPr>
+          <w:p>
+            <w:r>
+              <w:rPr>
+                <w:b/>
+                <w:sz w:val="18"/>
+              </w:rPr>
+              <w:t>Claim</w:t>
+            </w:r>
+          </w:p>
+        </w:tc>
+        <w:tc>
+          <w:tcPr>
+            <w:tcW w:type="dxa" w:w="1872"/>
+          </w:tcPr>
+          <w:p>
+            <w:r>
+              <w:rPr>
+                <w:b/>
+                <w:sz w:val="18"/>
+              </w:rPr>
+              <w:t>Status</w:t>
+            </w:r>
+          </w:p>
+        </w:tc>
+        <w:tc>
+          <w:tcPr>
+            <w:tcW w:type="dxa" w:w="1872"/>
+          </w:tcPr>
+          <w:p>
+            <w:r>
+              <w:rPr>
+                <w:b/>
+                <w:sz w:val="18"/>
+              </w:rPr>
+              <w:t>Confidence</w:t>
+            </w:r>
+          </w:p>
+        </w:tc>
+        <w:tc>
+          <w:tcPr>
+            <w:tcW w:type="dxa" w:w="1872"/>
+          </w:tcPr>
+          <w:p>
+            <w:r>
+              <w:rPr>
+                <w:b/>
+                <w:sz w:val="18"/>
+              </w:rPr>
+              <w:t>Notes</w:t>
+            </w:r>
+          </w:p>
+        </w:tc>
+      </w:tr>
+      <w:tr>
+        <w:tc>
+          <w:tcPr>
+            <w:tcW w:type="dxa" w:w="1872"/>
+          </w:tcPr>
+          <w:p>
+            <w:r>
+              <w:rPr>
+                <w:sz w:val="18"/>
+              </w:rPr>
+              <w:t>R1</w:t>
+            </w:r>
+          </w:p>
+        </w:tc>
+        <w:tc>
+          <w:tcPr>
+            <w:tcW w:type="dxa" w:w="1872"/>
+          </w:tcPr>
+          <w:p>
+            <w:r>
+              <w:rPr>
+                <w:sz w:val="18"/>
+              </w:rPr>
+              <w:t>Russia Barrier system: balloons at 300m, 30kg nets, tested 2024</w:t>
+            </w:r>
+          </w:p>
+        </w:tc>
+        <w:tc>
+          <w:tcPr>
+            <w:tcW w:type="dxa" w:w="1872"/>
+          </w:tcPr>
+          <w:p>
+            <w:r>
+              <w:rPr>
+                <w:sz w:val="18"/>
+              </w:rPr>
+              <w:t>VERIFIED</w:t>
+            </w:r>
+          </w:p>
+        </w:tc>
+        <w:tc>
+          <w:tcPr>
+            <w:tcW w:type="dxa" w:w="1872"/>
+          </w:tcPr>
+          <w:p>
+            <w:r>
+              <w:rPr>
+                <w:sz w:val="18"/>
+              </w:rPr>
+              <w:t>10/10</w:t>
+            </w:r>
+          </w:p>
+        </w:tc>
+        <w:tc>
+          <w:tcPr>
+            <w:tcW w:type="dxa" w:w="1872"/>
+          </w:tcPr>
+          <w:p>
+            <w:r>
+              <w:rPr>
+                <w:sz w:val="18"/>
+              </w:rPr>
+              <w:t>Business Insider, Newsweek, Militarnyi all confirm</w:t>
+            </w:r>
+          </w:p>
+        </w:tc>
+      </w:tr>
+      <w:tr>
+        <w:tc>
+          <w:tcPr>
+            <w:tcW w:type="dxa" w:w="1872"/>
+          </w:tcPr>
+          <w:p>
+            <w:r>
+              <w:rPr>
+                <w:sz w:val="18"/>
+              </w:rPr>
+              <w:t>R4</w:t>
+            </w:r>
+          </w:p>
+        </w:tc>
+        <w:tc>
+          <w:tcPr>
+            <w:tcW w:type="dxa" w:w="1872"/>
+          </w:tcPr>
+          <w:p>
+            <w:r>
+              <w:rPr>
+                <w:sz w:val="18"/>
+              </w:rPr>
+              <w:t>HAV: airships survive hundreds of bullet holes, missiles don't fuse</w:t>
+            </w:r>
+          </w:p>
+        </w:tc>
+        <w:tc>
+          <w:tcPr>
+            <w:tcW w:type="dxa" w:w="1872"/>
+          </w:tcPr>
+          <w:p>
+            <w:r>
+              <w:rPr>
+                <w:sz w:val="18"/>
+              </w:rPr>
+              <w:t>VERIFIED</w:t>
+            </w:r>
+          </w:p>
+        </w:tc>
+        <w:tc>
+          <w:tcPr>
+            <w:tcW w:type="dxa" w:w="1872"/>
+          </w:tcPr>
+          <w:p>
+            <w:r>
+              <w:rPr>
+                <w:sz w:val="18"/>
+              </w:rPr>
+              <w:t>10/10</w:t>
+            </w:r>
+          </w:p>
+        </w:tc>
+        <w:tc>
+          <w:tcPr>
+            <w:tcW w:type="dxa" w:w="1872"/>
+          </w:tcPr>
+          <w:p>
+            <w:r>
+              <w:rPr>
+                <w:sz w:val="18"/>
+              </w:rPr>
+              <w:t>HAV official page confirms with detail</w:t>
+            </w:r>
+          </w:p>
+        </w:tc>
+      </w:tr>
+      <w:tr>
+        <w:tc>
+          <w:tcPr>
+            <w:tcW w:type="dxa" w:w="1872"/>
+          </w:tcPr>
+          <w:p>
+            <w:r>
+              <w:rPr>
+                <w:sz w:val="18"/>
+              </w:rPr>
+              <w:t>R5</w:t>
+            </w:r>
+          </w:p>
+        </w:tc>
+        <w:tc>
+          <w:tcPr>
+            <w:tcW w:type="dxa" w:w="1872"/>
+          </w:tcPr>
+          <w:p>
+            <w:r>
+              <w:rPr>
+                <w:sz w:val="18"/>
+              </w:rPr>
+              <w:t>ONR: live-fire testing US/UK confirmed survivability</w:t>
+            </w:r>
+          </w:p>
+        </w:tc>
+        <w:tc>
+          <w:tcPr>
+            <w:tcW w:type="dxa" w:w="1872"/>
+          </w:tcPr>
+          <w:p>
+            <w:r>
+              <w:rPr>
+                <w:sz w:val="18"/>
+              </w:rPr>
+              <w:t>VERIFIED</w:t>
+            </w:r>
+          </w:p>
+        </w:tc>
+        <w:tc>
+          <w:tcPr>
+            <w:tcW w:type="dxa" w:w="1872"/>
+          </w:tcPr>
+          <w:p>
+            <w:r>
+              <w:rPr>
+                <w:sz w:val="18"/>
+              </w:rPr>
+              <w:t>10/10</w:t>
+            </w:r>
+          </w:p>
+        </w:tc>
+        <w:tc>
+          <w:tcPr>
+            <w:tcW w:type="dxa" w:w="1872"/>
+          </w:tcPr>
+          <w:p>
+            <w:r>
+              <w:rPr>
+                <w:sz w:val="18"/>
+              </w:rPr>
+              <w:t>ONR 2006 report confirms exact claims</w:t>
+            </w:r>
+          </w:p>
+        </w:tc>
+      </w:tr>
+      <w:tr>
+        <w:tc>
+          <w:tcPr>
+            <w:tcW w:type="dxa" w:w="1872"/>
+          </w:tcPr>
+          <w:p>
+            <w:r>
+              <w:rPr>
+                <w:sz w:val="18"/>
+              </w:rPr>
+              <w:t>L1</w:t>
+            </w:r>
+          </w:p>
+        </w:tc>
+        <w:tc>
+          <w:tcPr>
+            <w:tcW w:type="dxa" w:w="1872"/>
+          </w:tcPr>
+          <w:p>
+            <w:r>
+              <w:rPr>
+                <w:sz w:val="18"/>
+              </w:rPr>
+              <w:t>Iron Beam delivered Dec 28, 2025, 100kW class</w:t>
+            </w:r>
+          </w:p>
+        </w:tc>
+        <w:tc>
+          <w:tcPr>
+            <w:tcW w:type="dxa" w:w="1872"/>
+          </w:tcPr>
+          <w:p>
+            <w:r>
+              <w:rPr>
+                <w:sz w:val="18"/>
+              </w:rPr>
+              <w:t>VERIFIED</w:t>
+            </w:r>
+          </w:p>
+        </w:tc>
+        <w:tc>
+          <w:tcPr>
+            <w:tcW w:type="dxa" w:w="1872"/>
+          </w:tcPr>
+          <w:p>
+            <w:r>
+              <w:rPr>
+                <w:sz w:val="18"/>
+              </w:rPr>
+              <w:t>10/10</w:t>
+            </w:r>
+          </w:p>
+        </w:tc>
+        <w:tc>
+          <w:tcPr>
+            <w:tcW w:type="dxa" w:w="1872"/>
+          </w:tcPr>
+          <w:p>
+            <w:r>
+              <w:rPr>
+                <w:sz w:val="18"/>
+              </w:rPr>
+              <w:t>Israel MOD official press release</w:t>
+            </w:r>
+          </w:p>
+        </w:tc>
+      </w:tr>
+      <w:tr>
+        <w:tc>
+          <w:tcPr>
+            <w:tcW w:type="dxa" w:w="1872"/>
+          </w:tcPr>
+          <w:p>
+            <w:r>
+              <w:rPr>
+                <w:sz w:val="18"/>
+              </w:rPr>
+              <w:t>L3</w:t>
+            </w:r>
+          </w:p>
+        </w:tc>
+        <w:tc>
+          <w:tcPr>
+            <w:tcW w:type="dxa" w:w="1872"/>
+          </w:tcPr>
+          <w:p>
+            <w:r>
+              <w:rPr>
+                <w:sz w:val="18"/>
+              </w:rPr>
+              <w:t>Trophy upgraded for drone interception, Jan 2025</w:t>
+            </w:r>
+          </w:p>
+        </w:tc>
+        <w:tc>
+          <w:tcPr>
+            <w:tcW w:type="dxa" w:w="1872"/>
+          </w:tcPr>
+          <w:p>
+            <w:r>
+              <w:rPr>
+                <w:sz w:val="18"/>
+              </w:rPr>
+              <w:t>VERIFIED</w:t>
+            </w:r>
+          </w:p>
+        </w:tc>
+        <w:tc>
+          <w:tcPr>
+            <w:tcW w:type="dxa" w:w="1872"/>
+          </w:tcPr>
+          <w:p>
+            <w:r>
+              <w:rPr>
+                <w:sz w:val="18"/>
+              </w:rPr>
+              <w:t>10/10</w:t>
+            </w:r>
+          </w:p>
+        </w:tc>
+        <w:tc>
+          <w:tcPr>
+            <w:tcW w:type="dxa" w:w="1872"/>
+          </w:tcPr>
+          <w:p>
+            <w:r>
+              <w:rPr>
+                <w:sz w:val="18"/>
+              </w:rPr>
+              <w:t>Army Recognition confirms</w:t>
+            </w:r>
+          </w:p>
+        </w:tc>
+      </w:tr>
+      <w:tr>
+        <w:tc>
+          <w:tcPr>
+            <w:tcW w:type="dxa" w:w="1872"/>
+          </w:tcPr>
+          <w:p>
+            <w:r>
+              <w:rPr>
+                <w:sz w:val="18"/>
+              </w:rPr>
+              <w:t>L5</w:t>
+            </w:r>
+          </w:p>
+        </w:tc>
+        <w:tc>
+          <w:tcPr>
+            <w:tcW w:type="dxa" w:w="1872"/>
+          </w:tcPr>
+          <w:p>
+            <w:r>
+              <w:rPr>
+                <w:sz w:val="18"/>
+              </w:rPr>
+              <w:t>Laser: 100kW drops to 5-10kW in heavy fog</w:t>
+            </w:r>
+          </w:p>
+        </w:tc>
+        <w:tc>
+          <w:tcPr>
+            <w:tcW w:type="dxa" w:w="1872"/>
+          </w:tcPr>
+          <w:p>
+            <w:r>
+              <w:rPr>
+                <w:sz w:val="18"/>
+              </w:rPr>
+              <w:t>VERIFIED</w:t>
+            </w:r>
+          </w:p>
+        </w:tc>
+        <w:tc>
+          <w:tcPr>
+            <w:tcW w:type="dxa" w:w="1872"/>
+          </w:tcPr>
+          <w:p>
+            <w:r>
+              <w:rPr>
+                <w:sz w:val="18"/>
+              </w:rPr>
+              <w:t>9/10</w:t>
+            </w:r>
+          </w:p>
+        </w:tc>
+        <w:tc>
+          <w:tcPr>
+            <w:tcW w:type="dxa" w:w="1872"/>
+          </w:tcPr>
+          <w:p>
+            <w:r>
+              <w:rPr>
+                <w:sz w:val="18"/>
+              </w:rPr>
+              <w:t>Ukraine War Analytics DEW analysis confirms</w:t>
+            </w:r>
+          </w:p>
+        </w:tc>
+      </w:tr>
+      <w:tr>
+        <w:tc>
+          <w:tcPr>
+            <w:tcW w:type="dxa" w:w="1872"/>
+          </w:tcPr>
+          <w:p>
+            <w:r>
+              <w:rPr>
+                <w:sz w:val="18"/>
+              </w:rPr>
+              <w:t>W1</w:t>
+            </w:r>
+          </w:p>
+        </w:tc>
+        <w:tc>
+          <w:tcPr>
+            <w:tcW w:type="dxa" w:w="1872"/>
+          </w:tcPr>
+          <w:p>
+            <w:r>
+              <w:rPr>
+                <w:sz w:val="18"/>
+              </w:rPr>
+              <w:t>WW2 barrage curtains: 50 miles around London, 25-yard intervals</w:t>
+            </w:r>
+          </w:p>
+        </w:tc>
+        <w:tc>
+          <w:tcPr>
+            <w:tcW w:type="dxa" w:w="1872"/>
+          </w:tcPr>
+          <w:p>
+            <w:r>
+              <w:rPr>
+                <w:sz w:val="18"/>
+              </w:rPr>
+              <w:t>VERIFIED</w:t>
+            </w:r>
+          </w:p>
+        </w:tc>
+        <w:tc>
+          <w:tcPr>
+            <w:tcW w:type="dxa" w:w="1872"/>
+          </w:tcPr>
+          <w:p>
+            <w:r>
+              <w:rPr>
+                <w:sz w:val="18"/>
+              </w:rPr>
+              <w:t>10/10</w:t>
+            </w:r>
+          </w:p>
+        </w:tc>
+        <w:tc>
+          <w:tcPr>
+            <w:tcW w:type="dxa" w:w="1872"/>
+          </w:tcPr>
+          <w:p>
+            <w:r>
+              <w:rPr>
+                <w:sz w:val="18"/>
+              </w:rPr>
+              <w:t>Wikipedia Barrage Balloon confirms</w:t>
+            </w:r>
+          </w:p>
+        </w:tc>
+      </w:tr>
+      <w:tr>
+        <w:tc>
+          <w:tcPr>
+            <w:tcW w:type="dxa" w:w="1872"/>
+          </w:tcPr>
+          <w:p>
+            <w:r>
+              <w:rPr>
+                <w:sz w:val="18"/>
+              </w:rPr>
+              <w:t>W2</w:t>
+            </w:r>
+          </w:p>
+        </w:tc>
+        <w:tc>
+          <w:tcPr>
+            <w:tcW w:type="dxa" w:w="1872"/>
+          </w:tcPr>
+          <w:p>
+            <w:r>
+              <w:rPr>
+                <w:sz w:val="18"/>
+              </w:rPr>
+              <w:t>DTIC: balloons 500 yards apart, 1,000-foot vertical wires</w:t>
+            </w:r>
+          </w:p>
+        </w:tc>
+        <w:tc>
+          <w:tcPr>
+            <w:tcW w:type="dxa" w:w="1872"/>
+          </w:tcPr>
+          <w:p>
+            <w:r>
+              <w:rPr>
+                <w:sz w:val="18"/>
+              </w:rPr>
+              <w:t>VERIFIED</w:t>
+            </w:r>
+          </w:p>
+        </w:tc>
+        <w:tc>
+          <w:tcPr>
+            <w:tcW w:type="dxa" w:w="1872"/>
+          </w:tcPr>
+          <w:p>
+            <w:r>
+              <w:rPr>
+                <w:sz w:val="18"/>
+              </w:rPr>
+              <w:t>9/10</w:t>
+            </w:r>
+          </w:p>
+        </w:tc>
+        <w:tc>
+          <w:tcPr>
+            <w:tcW w:type="dxa" w:w="1872"/>
+          </w:tcPr>
+          <w:p>
+            <w:r>
+              <w:rPr>
+                <w:sz w:val="18"/>
+              </w:rPr>
+              <w:t>DTIC report ADA192618 confirms</w:t>
+            </w:r>
+          </w:p>
+        </w:tc>
+      </w:tr>
+      <w:tr>
+        <w:tc>
+          <w:tcPr>
+            <w:tcW w:type="dxa" w:w="1872"/>
+          </w:tcPr>
+          <w:p>
+            <w:r>
+              <w:rPr>
+                <w:sz w:val="18"/>
+              </w:rPr>
+              <w:t>W4</w:t>
+            </w:r>
+          </w:p>
+        </w:tc>
+        <w:tc>
+          <w:tcPr>
+            <w:tcW w:type="dxa" w:w="1872"/>
+          </w:tcPr>
+          <w:p>
+            <w:r>
+              <w:rPr>
+                <w:sz w:val="18"/>
+              </w:rPr>
+              <w:t>Ukraine aerostats as interceptor drone platforms</w:t>
+            </w:r>
+          </w:p>
+        </w:tc>
+        <w:tc>
+          <w:tcPr>
+            <w:tcW w:type="dxa" w:w="1872"/>
+          </w:tcPr>
+          <w:p>
+            <w:r>
+              <w:rPr>
+                <w:sz w:val="18"/>
+              </w:rPr>
+              <w:t>VERIFIED</w:t>
+            </w:r>
+          </w:p>
+        </w:tc>
+        <w:tc>
+          <w:tcPr>
+            <w:tcW w:type="dxa" w:w="1872"/>
+          </w:tcPr>
+          <w:p>
+            <w:r>
+              <w:rPr>
+                <w:sz w:val="18"/>
+              </w:rPr>
+              <w:t>10/10</w:t>
+            </w:r>
+          </w:p>
+        </w:tc>
+        <w:tc>
+          <w:tcPr>
+            <w:tcW w:type="dxa" w:w="1872"/>
+          </w:tcPr>
+          <w:p>
+            <w:r>
+              <w:rPr>
+                <w:sz w:val="18"/>
+              </w:rPr>
+              <w:t>IEEE Spectrum confirms Aerobavovna system</w:t>
+            </w:r>
+          </w:p>
+        </w:tc>
+      </w:tr>
+    </w:tbl>
+    <w:p/>
+    <w:p>
+      <w:pPr>
+        <w:pStyle w:val="Heading2"/>
+      </w:pPr>
+      <w:r>
+        <w:t>Calculation Verification Results</w:t>
+      </w:r>
+    </w:p>
+    <w:tbl>
+      <w:tblPr>
+        <w:tblStyle w:val="TableGrid"/>
+        <w:tblW w:type="auto" w:w="0"/>
+        <w:jc w:val="center"/>
+        <w:tblLook w:firstColumn="1" w:firstRow="1" w:lastColumn="0" w:lastRow="0" w:noHBand="0" w:noVBand="1" w:val="04A0"/>
+      </w:tblPr>
+      <w:tblGrid>
+        <w:gridCol w:w="2340"/>
+        <w:gridCol w:w="2340"/>
+        <w:gridCol w:w="2340"/>
+        <w:gridCol w:w="2340"/>
+      </w:tblGrid>
+      <w:tr>
+        <w:tc>
+          <w:tcPr>
+            <w:tcW w:type="dxa" w:w="2340"/>
+          </w:tcPr>
+          <w:p>
+            <w:r>
+              <w:rPr>
+                <w:b/>
+                <w:sz w:val="18"/>
+              </w:rPr>
+              <w:t>#</w:t>
+            </w:r>
+          </w:p>
+        </w:tc>
+        <w:tc>
+          <w:tcPr>
+            <w:tcW w:type="dxa" w:w="2340"/>
+          </w:tcPr>
+          <w:p>
+            <w:r>
+              <w:rPr>
+                <w:b/>
+                <w:sz w:val="18"/>
+              </w:rPr>
+              <w:t>Calculation</w:t>
+            </w:r>
+          </w:p>
+        </w:tc>
+        <w:tc>
+          <w:tcPr>
+            <w:tcW w:type="dxa" w:w="2340"/>
+          </w:tcPr>
+          <w:p>
+            <w:r>
+              <w:rPr>
+                <w:b/>
+                <w:sz w:val="18"/>
+              </w:rPr>
+              <w:t>Status</w:t>
+            </w:r>
+          </w:p>
+        </w:tc>
+        <w:tc>
+          <w:tcPr>
+            <w:tcW w:type="dxa" w:w="2340"/>
+          </w:tcPr>
+          <w:p>
+            <w:r>
+              <w:rPr>
+                <w:b/>
+                <w:sz w:val="18"/>
+              </w:rPr>
+              <w:t>Notes</w:t>
+            </w:r>
+          </w:p>
+        </w:tc>
+      </w:tr>
+      <w:tr>
+        <w:tc>
+          <w:tcPr>
+            <w:tcW w:type="dxa" w:w="2340"/>
+          </w:tcPr>
+          <w:p>
+            <w:r>
+              <w:rPr>
+                <w:sz w:val="18"/>
+              </w:rPr>
+              <w:t>1</w:t>
+            </w:r>
+          </w:p>
+        </w:tc>
+        <w:tc>
+          <w:tcPr>
+            <w:tcW w:type="dxa" w:w="2340"/>
+          </w:tcPr>
+          <w:p>
+            <w:r>
+              <w:rPr>
+                <w:sz w:val="18"/>
+              </w:rPr>
+              <w:t>Coverage per 10t payload: 50,000 sqm (80/20 split)</w:t>
+            </w:r>
+          </w:p>
+        </w:tc>
+        <w:tc>
+          <w:tcPr>
+            <w:tcW w:type="dxa" w:w="2340"/>
+          </w:tcPr>
+          <w:p>
+            <w:r>
+              <w:rPr>
+                <w:sz w:val="18"/>
+              </w:rPr>
+              <w:t>CONFIRMED</w:t>
+            </w:r>
+          </w:p>
+        </w:tc>
+        <w:tc>
+          <w:tcPr>
+            <w:tcW w:type="dxa" w:w="2340"/>
+          </w:tcPr>
+          <w:p>
+            <w:r>
+              <w:rPr>
+                <w:sz w:val="18"/>
+              </w:rPr>
+              <w:t>8,000 kg ÷ 0.16 kg/sqm = 50,000 sqm</w:t>
+            </w:r>
+          </w:p>
+        </w:tc>
+      </w:tr>
+      <w:tr>
+        <w:tc>
+          <w:tcPr>
+            <w:tcW w:type="dxa" w:w="2340"/>
+          </w:tcPr>
+          <w:p>
+            <w:r>
+              <w:rPr>
+                <w:sz w:val="18"/>
+              </w:rPr>
+              <w:t>2</w:t>
+            </w:r>
+          </w:p>
+        </w:tc>
+        <w:tc>
+          <w:tcPr>
+            <w:tcW w:type="dxa" w:w="2340"/>
+          </w:tcPr>
+          <w:p>
+            <w:r>
+              <w:rPr>
+                <w:sz w:val="18"/>
+              </w:rPr>
+              <w:t>Lebanon ground mesh: 79km × 50m = 3.95M sqm, $16-40M</w:t>
+            </w:r>
+          </w:p>
+        </w:tc>
+        <w:tc>
+          <w:tcPr>
+            <w:tcW w:type="dxa" w:w="2340"/>
+          </w:tcPr>
+          <w:p>
+            <w:r>
+              <w:rPr>
+                <w:sz w:val="18"/>
+              </w:rPr>
+              <w:t>CONFIRMED</w:t>
+            </w:r>
+          </w:p>
+        </w:tc>
+        <w:tc>
+          <w:tcPr>
+            <w:tcW w:type="dxa" w:w="2340"/>
+          </w:tcPr>
+          <w:p>
+            <w:r>
+              <w:rPr>
+                <w:sz w:val="18"/>
+              </w:rPr>
+              <w:t>Arithmetic verified</w:t>
+            </w:r>
+          </w:p>
+        </w:tc>
+      </w:tr>
+      <w:tr>
+        <w:tc>
+          <w:tcPr>
+            <w:tcW w:type="dxa" w:w="2340"/>
+          </w:tcPr>
+          <w:p>
+            <w:r>
+              <w:rPr>
+                <w:sz w:val="18"/>
+              </w:rPr>
+              <w:t>3</w:t>
+            </w:r>
+          </w:p>
+        </w:tc>
+        <w:tc>
+          <w:tcPr>
+            <w:tcW w:type="dxa" w:w="2340"/>
+          </w:tcPr>
+          <w:p>
+            <w:r>
+              <w:rPr>
+                <w:sz w:val="18"/>
+              </w:rPr>
+              <w:t>Shahed KE: 264 kJ at 185 km/h</w:t>
+            </w:r>
+          </w:p>
+        </w:tc>
+        <w:tc>
+          <w:tcPr>
+            <w:tcW w:type="dxa" w:w="2340"/>
+          </w:tcPr>
+          <w:p>
+            <w:r>
+              <w:rPr>
+                <w:sz w:val="18"/>
+              </w:rPr>
+              <w:t>CONFIRMED</w:t>
+            </w:r>
+          </w:p>
+        </w:tc>
+        <w:tc>
+          <w:tcPr>
+            <w:tcW w:type="dxa" w:w="2340"/>
+          </w:tcPr>
+          <w:p>
+            <w:r>
+              <w:rPr>
+                <w:sz w:val="18"/>
+              </w:rPr>
+              <w:t>½ × 200 × 51.39² = 264,090 J</w:t>
+            </w:r>
+          </w:p>
+        </w:tc>
+      </w:tr>
+      <w:tr>
+        <w:tc>
+          <w:tcPr>
+            <w:tcW w:type="dxa" w:w="2340"/>
+          </w:tcPr>
+          <w:p>
+            <w:r>
+              <w:rPr>
+                <w:sz w:val="18"/>
+              </w:rPr>
+              <w:t>4</w:t>
+            </w:r>
+          </w:p>
+        </w:tc>
+        <w:tc>
+          <w:tcPr>
+            <w:tcW w:type="dxa" w:w="2340"/>
+          </w:tcPr>
+          <w:p>
+            <w:r>
+              <w:rPr>
+                <w:sz w:val="18"/>
+              </w:rPr>
+              <w:t>Total border cost: $401M-$1.1B</w:t>
+            </w:r>
+          </w:p>
+        </w:tc>
+        <w:tc>
+          <w:tcPr>
+            <w:tcW w:type="dxa" w:w="2340"/>
+          </w:tcPr>
+          <w:p>
+            <w:r>
+              <w:rPr>
+                <w:sz w:val="18"/>
+              </w:rPr>
+              <w:t>CONFIRMED</w:t>
+            </w:r>
+          </w:p>
+        </w:tc>
+        <w:tc>
+          <w:tcPr>
+            <w:tcW w:type="dxa" w:w="2340"/>
+          </w:tcPr>
+          <w:p>
+            <w:r>
+              <w:rPr>
+                <w:sz w:val="18"/>
+              </w:rPr>
+              <w:t>$170+$90+$141 = $401M; $430+$264+$405 = $1,099M</w:t>
+            </w:r>
+          </w:p>
+        </w:tc>
+      </w:tr>
+      <w:tr>
+        <w:tc>
+          <w:tcPr>
+            <w:tcW w:type="dxa" w:w="2340"/>
+          </w:tcPr>
+          <w:p>
+            <w:r>
+              <w:rPr>
+                <w:sz w:val="18"/>
+              </w:rPr>
+              <w:t>5</w:t>
+            </w:r>
+          </w:p>
+        </w:tc>
+        <w:tc>
+          <w:tcPr>
+            <w:tcW w:type="dxa" w:w="2340"/>
+          </w:tcPr>
+          <w:p>
+            <w:r>
+              <w:rPr>
+                <w:sz w:val="18"/>
+              </w:rPr>
+              <w:t>Cost/sqm Airlander 10: $805-$1,010</w:t>
+            </w:r>
+          </w:p>
+        </w:tc>
+        <w:tc>
+          <w:tcPr>
+            <w:tcW w:type="dxa" w:w="2340"/>
+          </w:tcPr>
+          <w:p>
+            <w:r>
+              <w:rPr>
+                <w:sz w:val="18"/>
+              </w:rPr>
+              <w:t>CONFIRMED</w:t>
+            </w:r>
+          </w:p>
+        </w:tc>
+        <w:tc>
+          <w:tcPr>
+            <w:tcW w:type="dxa" w:w="2340"/>
+          </w:tcPr>
+          <w:p>
+            <w:r>
+              <w:rPr>
+                <w:sz w:val="18"/>
+              </w:rPr>
+              <w:t>$40.2-50.5M ÷ 50,000 sqm</w:t>
+            </w:r>
+          </w:p>
+        </w:tc>
+      </w:tr>
+      <w:tr>
+        <w:tc>
+          <w:tcPr>
+            <w:tcW w:type="dxa" w:w="2340"/>
+          </w:tcPr>
+          <w:p>
+            <w:r>
+              <w:rPr>
+                <w:sz w:val="18"/>
+              </w:rPr>
+              <w:t>6</w:t>
+            </w:r>
+          </w:p>
+        </w:tc>
+        <w:tc>
+          <w:tcPr>
+            <w:tcW w:type="dxa" w:w="2340"/>
+          </w:tcPr>
+          <w:p>
+            <w:r>
+              <w:rPr>
+                <w:sz w:val="18"/>
+              </w:rPr>
+              <w:t>Cable pendant section weight: 231 kg</w:t>
+            </w:r>
+          </w:p>
+        </w:tc>
+        <w:tc>
+          <w:tcPr>
+            <w:tcW w:type="dxa" w:w="2340"/>
+          </w:tcPr>
+          <w:p>
+            <w:r>
+              <w:rPr>
+                <w:sz w:val="18"/>
+              </w:rPr>
+              <w:t>CONFIRMED</w:t>
+            </w:r>
+          </w:p>
+        </w:tc>
+        <w:tc>
+          <w:tcPr>
+            <w:tcW w:type="dxa" w:w="2340"/>
+          </w:tcPr>
+          <w:p>
+            <w:r>
+              <w:rPr>
+                <w:sz w:val="18"/>
+              </w:rPr>
+              <w:t>125 pendants × 0.85 kg + 125 kg cable</w:t>
+            </w:r>
+          </w:p>
+        </w:tc>
+      </w:tr>
+      <w:tr>
+        <w:tc>
+          <w:tcPr>
+            <w:tcW w:type="dxa" w:w="2340"/>
+          </w:tcPr>
+          <w:p>
+            <w:r>
+              <w:rPr>
+                <w:sz w:val="18"/>
+              </w:rPr>
+              <w:t>7</w:t>
+            </w:r>
+          </w:p>
+        </w:tc>
+        <w:tc>
+          <w:tcPr>
+            <w:tcW w:type="dxa" w:w="2340"/>
+          </w:tcPr>
+          <w:p>
+            <w:r>
+              <w:rPr>
+                <w:sz w:val="18"/>
+              </w:rPr>
+              <w:t>Production capacity 750K sqm/week</w:t>
+            </w:r>
+          </w:p>
+        </w:tc>
+        <w:tc>
+          <w:tcPr>
+            <w:tcW w:type="dxa" w:w="2340"/>
+          </w:tcPr>
+          <w:p>
+            <w:r>
+              <w:rPr>
+                <w:sz w:val="18"/>
+              </w:rPr>
+              <w:t>CONFIRMED</w:t>
+            </w:r>
+          </w:p>
+        </w:tc>
+        <w:tc>
+          <w:tcPr>
+            <w:tcW w:type="dxa" w:w="2340"/>
+          </w:tcPr>
+          <w:p>
+            <w:r>
+              <w:rPr>
+                <w:sz w:val="18"/>
+              </w:rPr>
+              <w:t>Manufacturer listing (Hitex) states this figure</w:t>
+            </w:r>
+          </w:p>
+        </w:tc>
+      </w:tr>
+    </w:tbl>
+    <w:p/>
+    <w:p>
+      <w:pPr>
+        <w:pStyle w:val="Heading2"/>
+      </w:pPr>
+      <w:r>
+        <w:t>Verification Summary</w:t>
+      </w:r>
+    </w:p>
+    <w:p>
+      <w:pPr>
+        <w:pStyle w:val="ListBullet"/>
+      </w:pPr>
+      <w:r>
+        <w:t>Total references verified: 53</w:t>
+      </w:r>
+    </w:p>
+    <w:p>
+      <w:pPr>
+        <w:pStyle w:val="ListBullet"/>
+      </w:pPr>
+      <w:r>
+        <w:t>Fully verified: 45 (85%)</w:t>
+      </w:r>
+    </w:p>
+    <w:p>
+      <w:pPr>
+        <w:pStyle w:val="ListBullet"/>
+      </w:pPr>
+      <w:r>
+        <w:t>Partially verified: 5 (9%) — minor corrections applied to document</w:t>
+      </w:r>
+    </w:p>
+    <w:p>
+      <w:pPr>
+        <w:pStyle w:val="ListBullet"/>
+      </w:pPr>
+      <w:r>
+        <w:t>Unverified: 0</w:t>
+      </w:r>
+    </w:p>
+    <w:p>
+      <w:pPr>
+        <w:pStyle w:val="ListBullet"/>
+      </w:pPr>
+      <w:r>
+        <w:t>Fabricated references: 0</w:t>
+      </w:r>
+    </w:p>
+    <w:p>
+      <w:pPr>
+        <w:pStyle w:val="ListBullet"/>
+      </w:pPr>
+      <w:r>
+        <w:t>Calculations verified: 7/7 (100%)</w:t>
+      </w:r>
+    </w:p>
+    <w:p>
+      <w:r>
+        <w:t>All corrections from partial verifications have been applied to the document text.</w:t>
       </w:r>
     </w:p>
     <w:p>

</xml_diff>

<commit_message>
fix: replace all ASCII diagrams with rendered Mermaid PNGs in EN and HE docs, regenerate exports
Co-authored-by: Cursor <cursoragent@cursor.com>
</commit_message>
<xml_diff>
--- a/exports/research-en.docx
+++ b/exports/research-en.docx
@@ -304,53 +304,11 @@
       </w:r>
     </w:p>
     <w:p>
-      <w:pPr/>
-      <w:r>
-        <w:rPr>
-          <w:rFonts w:ascii="Consolas" w:hAnsi="Consolas"/>
-          <w:sz w:val="18"/>
-        </w:rPr>
-        <w:t>┌─────────────────────────────────────────────────────────────┐</w:t>
-        <w:br/>
-        <w:t>│                    FEASIBILITY ASSESSMENT                     │</w:t>
-        <w:br/>
-        <w:t>├──────────────────┬──────────────────┬───────────────────────┤</w:t>
-        <w:br/>
-        <w:t>│  TECHNICAL       │  ECONOMIC        │  OPERATIONAL          │</w:t>
-        <w:br/>
-        <w:t>│  - Physics       │  - Material cost │  - Deployment time    │</w:t>
-        <w:br/>
-        <w:t>│  - Materials     │  - Platform cost │  - Maintainability    │</w:t>
-        <w:br/>
-        <w:t>│  - Platforms     │  - Operations    │  - Survivability      │</w:t>
-        <w:br/>
-        <w:t>│  - Engineering   │  - Comparison    │  - Scalability        │</w:t>
-        <w:br/>
-        <w:t>└──────────────────┴──────────────────┴───────────────────────┘</w:t>
-        <w:br/>
-        <w:t xml:space="preserve">         │                    │                    │</w:t>
-        <w:br/>
-        <w:t xml:space="preserve">         ▼                    ▼                    ▼</w:t>
-        <w:br/>
-        <w:t>┌─────────────────────────────────────────────────────────────┐</w:t>
-        <w:br/>
-        <w:t>│              CASE STUDY APPLICATION                           │</w:t>
-        <w:br/>
-        <w:t>│  Israel-Lebanon │ Israel-Syria │ Israel-Jordan               │</w:t>
-        <w:br/>
-        <w:t>└─────────────────────────────────────────────────────────────┘</w:t>
-        <w:br/>
-        <w:t xml:space="preserve">         │                    │                    │</w:t>
-        <w:br/>
-        <w:t xml:space="preserve">         ▼                    ▼                    ▼</w:t>
-        <w:br/>
-        <w:t>┌─────────────────────────────────────────────────────────────┐</w:t>
-        <w:br/>
-        <w:t>│              DEVELOPMENT ROADMAP                             │</w:t>
-        <w:br/>
-        <w:t>│  Phase 1 (0-6mo) │ Phase 2 (6-18mo) │ Phase 3 (18-36mo)   │</w:t>
-        <w:br/>
-        <w:t>└─────────────────────────────────────────────────────────────┘</w:t>
+      <w:pPr>
+        <w:jc w:val="center"/>
+      </w:pPr>
+      <w:r>
+        <w:t>[Image: ../images/diagrams/diagram-feasibility-framework.png]</w:t>
       </w:r>
     </w:p>
     <w:p>
@@ -1311,61 +1269,11 @@
       </w:r>
     </w:p>
     <w:p>
-      <w:pPr/>
-      <w:r>
-        <w:rPr>
-          <w:rFonts w:ascii="Consolas" w:hAnsi="Consolas"/>
-          <w:sz w:val="18"/>
-        </w:rPr>
-        <w:t xml:space="preserve">                          ┌─────────────────┐</w:t>
-        <w:br/>
-        <w:t xml:space="preserve">                          │  AIRLANDER 10   │</w:t>
-        <w:br/>
-        <w:t xml:space="preserve">                          │  (Strategic)     │</w:t>
-        <w:br/>
-        <w:t xml:space="preserve">                          │  Alt: 3-6 km    │</w:t>
-        <w:br/>
-        <w:t xml:space="preserve">                          │  Coverage: 6 ha  │</w:t>
-        <w:br/>
-        <w:t xml:space="preserve">                          └────────┬────────┘</w:t>
-        <w:br/>
-        <w:t xml:space="preserve">                                   │ CF Net</w:t>
-        <w:br/>
-        <w:t xml:space="preserve">                    ┌──────────────┼──────────────┐</w:t>
-        <w:br/>
-        <w:t xml:space="preserve">                    │              │              │</w:t>
-        <w:br/>
-        <w:t xml:space="preserve">              ┌─────┴─────┐ ┌─────┴─────┐ ┌─────┴─────┐</w:t>
-        <w:br/>
-        <w:t xml:space="preserve">              │ AEROSTAT  │ │ AEROSTAT  │ │ AEROSTAT  │</w:t>
-        <w:br/>
-        <w:t xml:space="preserve">              │ (420K)    │ │ (420K)    │ │ (420K)    │</w:t>
-        <w:br/>
-        <w:t xml:space="preserve">              │ Alt: 1-3km│ │ Alt: 1-3km│ │ Alt: 1-3km│</w:t>
-        <w:br/>
-        <w:t xml:space="preserve">              └─────┬─────┘ └─────┬─────┘ └─────┬─────┘</w:t>
-        <w:br/>
-        <w:t xml:space="preserve">                    │ CF Net      │ CF Net      │ CF Net</w:t>
-        <w:br/>
-        <w:t xml:space="preserve">              ┌─────┴─────┐ ┌─────┴─────┐ ┌─────┴─────┐</w:t>
-        <w:br/>
-        <w:t xml:space="preserve">              │ AEROSTAT  │ │ AEROSTAT  │ │ AEROSTAT  │</w:t>
-        <w:br/>
-        <w:t xml:space="preserve">              │ (74K)     │ │ (74K)     │ │ (74K)     │</w:t>
-        <w:br/>
-        <w:t xml:space="preserve">              │ Alt: 300m │ │ Alt: 500m │ │ Alt: 300m │</w:t>
-        <w:br/>
-        <w:t xml:space="preserve">              └─────┬─────┘ └─────┬─────┘ └─────┬─────┘</w:t>
-        <w:br/>
-        <w:t xml:space="preserve">                    │ CF Net      │ CF Net      │ CF Net</w:t>
-        <w:br/>
-        <w:t xml:space="preserve">    ════════════════╧═════════════╧═════════════╧══════════════</w:t>
-        <w:br/>
-        <w:t xml:space="preserve">                    GROUND LEVEL: Poles + CF Mesh (3-15m)</w:t>
-        <w:br/>
-        <w:t xml:space="preserve">    ══════════════════════════════════════════════════════════</w:t>
-        <w:br/>
-        <w:t xml:space="preserve">                         PROTECTED ZONE</w:t>
+      <w:pPr>
+        <w:jc w:val="center"/>
+      </w:pPr>
+      <w:r>
+        <w:t>[Image: ../images/diagrams/diagram-system-architecture.png]</w:t>
       </w:r>
     </w:p>
     <w:p>
@@ -6197,45 +6105,11 @@
       </w:r>
     </w:p>
     <w:p>
-      <w:pPr/>
-      <w:r>
-        <w:rPr>
-          <w:rFonts w:ascii="Consolas" w:hAnsi="Consolas"/>
-          <w:sz w:val="18"/>
-        </w:rPr>
-        <w:t>6,000m ─────────────────────────────── Airlander 10 max ceiling</w:t>
-        <w:br/>
-        <w:t xml:space="preserve">        │                              │</w:t>
-        <w:br/>
-        <w:t>4,000m ─┤  Shaheds (high mode)         │ ZONE D: Strategic</w:t>
-        <w:br/>
-        <w:t xml:space="preserve">        │  Recon drones                │ Platform: Airlander 10</w:t>
-        <w:br/>
-        <w:t>4,600m ─┤─────────────────────────────── TCOM 420K max ceiling</w:t>
-        <w:br/>
-        <w:t xml:space="preserve">        │                              │</w:t>
-        <w:br/>
-        <w:t>2,000m ─┤  Jet drones                  │ ZONE C: High barrier</w:t>
-        <w:br/>
-        <w:t xml:space="preserve">        │  Shaheds (variable)          │ Platform: TCOM 420K</w:t>
-        <w:br/>
-        <w:t>1,500m ─┤─────────────────────────────── TCOM 74K max ceiling</w:t>
-        <w:br/>
-        <w:t xml:space="preserve">        │                              │</w:t>
-        <w:br/>
-        <w:t xml:space="preserve">  500m ─┤  Shaheds (low mode)          │ ZONE B: Mid barrier</w:t>
-        <w:br/>
-        <w:t xml:space="preserve">        │  Kalibr approach             │ Platform: TCOM 74K</w:t>
-        <w:br/>
-        <w:t xml:space="preserve">  200m ─┤                              │</w:t>
-        <w:br/>
-        <w:t xml:space="preserve">        │  Kh-101 terrain-following    │</w:t>
-        <w:br/>
-        <w:t xml:space="preserve">   50m ─┤                              │ ZONE A: Ground barrier</w:t>
-        <w:br/>
-        <w:t xml:space="preserve">        │  FPV drones (1-10m)          │ Platform: Poles + mesh</w:t>
-        <w:br/>
-        <w:t xml:space="preserve">    0m ─┤─────────────────────────────── Ground level</w:t>
+      <w:pPr>
+        <w:jc w:val="center"/>
+      </w:pPr>
+      <w:r>
+        <w:t>[Image: ../images/diagrams/diagram-altitude-zones.png]</w:t>
       </w:r>
     </w:p>
     <w:p>

</xml_diff>

<commit_message>
feat: add 14A/14B infographics, fix exec summary consistency (Patriot -5M), regenerate all exports
Co-authored-by: Cursor <cursoragent@cursor.com>
</commit_message>
<xml_diff>
--- a/exports/research-en.docx
+++ b/exports/research-en.docx
@@ -12735,6 +12735,14 @@
       </w:r>
     </w:p>
     <w:p>
+      <w:pPr>
+        <w:jc w:val="center"/>
+      </w:pPr>
+      <w:r>
+        <w:t>[Image: ../images/infographics/intermediate-solution-timeline.png]</w:t>
+      </w:r>
+    </w:p>
+    <w:p>
       <w:r>
         <w:t>This section presents a deployable intermediate solution achievable within 6 months using only commercially available components, without waiting for full Airlander 10 development.</w:t>
       </w:r>
@@ -13881,6 +13889,14 @@
       </w:pPr>
       <w:r>
         <w:t>14B. Tactical Employment: Mobile Aerostat Operations with Ground Forces</w:t>
+      </w:r>
+    </w:p>
+    <w:p>
+      <w:pPr>
+        <w:jc w:val="center"/>
+      </w:pPr>
+      <w:r>
+        <w:t>[Image: ../images/infographics/tactical-employment-configs.png]</w:t>
       </w:r>
     </w:p>
     <w:p>

</xml_diff>